<commit_message>
Calculating value of PLO hand
</commit_message>
<xml_diff>
--- a/poker hand distribution checkpoint 20250814.docx
+++ b/poker hand distribution checkpoint 20250814.docx
@@ -82,6 +82,4088 @@
       <w:r>
         <w:lastRenderedPageBreak/>
         <w:t>display the multiple chosen hands on this chart as separate lines. This would be one large chart taking the entire chart area. The cumulative frequency chart would show the cumulative frequency of rankings for the hand.</w:t>
+      </w:r>
+    </w:p>
+    <w:p/>
+    <w:p/>
+    <w:p>
+      <w:r>
+        <w:br w:type="page"/>
+      </w:r>
+    </w:p>
+    <w:p>
+      <w:r>
+        <w:lastRenderedPageBreak/>
+        <w:t xml:space="preserve">import React, </w:t>
+      </w:r>
+      <w:proofErr w:type="gramStart"/>
+      <w:r>
+        <w:t xml:space="preserve">{ </w:t>
+      </w:r>
+      <w:proofErr w:type="spellStart"/>
+      <w:r>
+        <w:t>useState</w:t>
+      </w:r>
+      <w:proofErr w:type="spellEnd"/>
+      <w:proofErr w:type="gramEnd"/>
+      <w:r>
+        <w:t xml:space="preserve">, </w:t>
+      </w:r>
+      <w:proofErr w:type="spellStart"/>
+      <w:proofErr w:type="gramStart"/>
+      <w:r>
+        <w:t>useMemo</w:t>
+      </w:r>
+      <w:proofErr w:type="spellEnd"/>
+      <w:r>
+        <w:t xml:space="preserve"> }</w:t>
+      </w:r>
+      <w:proofErr w:type="gramEnd"/>
+      <w:r>
+        <w:t xml:space="preserve"> from 'react';</w:t>
+      </w:r>
+    </w:p>
+    <w:p>
+      <w:r>
+        <w:t xml:space="preserve">import </w:t>
+      </w:r>
+      <w:proofErr w:type="gramStart"/>
+      <w:r>
+        <w:t xml:space="preserve">{ </w:t>
+      </w:r>
+      <w:proofErr w:type="spellStart"/>
+      <w:r>
+        <w:t>LineChart</w:t>
+      </w:r>
+      <w:proofErr w:type="spellEnd"/>
+      <w:proofErr w:type="gramEnd"/>
+      <w:r>
+        <w:t xml:space="preserve">, Line, </w:t>
+      </w:r>
+      <w:proofErr w:type="spellStart"/>
+      <w:r>
+        <w:t>XAxis</w:t>
+      </w:r>
+      <w:proofErr w:type="spellEnd"/>
+      <w:r>
+        <w:t xml:space="preserve">, </w:t>
+      </w:r>
+      <w:proofErr w:type="spellStart"/>
+      <w:r>
+        <w:t>YAxis</w:t>
+      </w:r>
+      <w:proofErr w:type="spellEnd"/>
+      <w:r>
+        <w:t xml:space="preserve">, </w:t>
+      </w:r>
+      <w:proofErr w:type="spellStart"/>
+      <w:r>
+        <w:t>CartesianGrid</w:t>
+      </w:r>
+      <w:proofErr w:type="spellEnd"/>
+      <w:r>
+        <w:t xml:space="preserve">, Tooltip, Legend, </w:t>
+      </w:r>
+      <w:proofErr w:type="spellStart"/>
+      <w:r>
+        <w:t>ResponsiveContainer</w:t>
+      </w:r>
+      <w:proofErr w:type="spellEnd"/>
+      <w:r>
+        <w:t xml:space="preserve">, </w:t>
+      </w:r>
+      <w:proofErr w:type="spellStart"/>
+      <w:r>
+        <w:t>BarChart</w:t>
+      </w:r>
+      <w:proofErr w:type="spellEnd"/>
+      <w:r>
+        <w:t xml:space="preserve">, </w:t>
+      </w:r>
+      <w:proofErr w:type="gramStart"/>
+      <w:r>
+        <w:t>Bar }</w:t>
+      </w:r>
+      <w:proofErr w:type="gramEnd"/>
+      <w:r>
+        <w:t xml:space="preserve"> from 'recharts';</w:t>
+      </w:r>
+    </w:p>
+    <w:p/>
+    <w:p>
+      <w:r>
+        <w:t>// Mock data for demonstration - replace with your actual JSON data</w:t>
+      </w:r>
+    </w:p>
+    <w:p>
+      <w:proofErr w:type="spellStart"/>
+      <w:r>
+        <w:t>const</w:t>
+      </w:r>
+      <w:proofErr w:type="spellEnd"/>
+      <w:r>
+        <w:t xml:space="preserve"> </w:t>
+      </w:r>
+      <w:proofErr w:type="spellStart"/>
+      <w:r>
+        <w:t>mockHandData</w:t>
+      </w:r>
+      <w:proofErr w:type="spellEnd"/>
+      <w:r>
+        <w:t xml:space="preserve"> = {</w:t>
+      </w:r>
+    </w:p>
+    <w:p>
+      <w:r>
+        <w:t xml:space="preserve">  "22": [0.00841001730973175, 0.008034581260230062, 0.08405726675911118, 0.00013576199430810016, 0.0226973905355108, 0.013930466015916642, 0.010071444233778301, 0.00023386792822728482, 0.009885412025393054, 0.004666670213220349, 0.00025187301400590376, 0.00024526063740019737, 0.0002464520748787839, 0.0002498536897450557, 0.0002523594362979127, 0.0002543558729511541, 0.0027824934173364775, 0.0066092206538769386, 0.0003304781169291446, 0.004083821300424882, 0.0014949120309417563, 0.001958012235776421, 0.002173796976741885, 0.0005969640405474478, 0.0005914892123320824, 0.0005922365584856025, 0.0005922365584856025, 0.0005930842555464459, 0.0005987759358117638, 0.0006020993001645586, 0.0006160277707598255, 0.001957340357132391, 0.012437471859103502, 0.021422187827684597, 0.0038365349896245992, 0.0026156481371312473, 0.003177389686145467, 0.00220166017416689, 0.0008132571644719924, 0.0001742287241943144, 0.00017448062425548405, 0.00017472965423116549, 0.00017636736122664324, 0.00018368829448971164, 0.00020370026789114405, 0.0003786340466569288, 0.09583551118152313, 0.049325713070374616, 0.023355532193726304, 0.08288152702396283, 0.02892262303769936, 0.02769536593973364, 0.017023871748309747, 0.007043591324757451, 0.00407518015777359, 0.00041585292411351675, 0.00029495558059067434, 0.0003335189410276212, 0.014707210583806267, 0.056164366492808177, 0.004568479175689469, 0.06681590496311583, 0.08334684647738504, 0.028287790607222, 0.010645969823190828, 0.015783723533855133, 0.00040328479482335, 0.0004441087482178445, 0.016680141100055404, 0.007869340020730147, 0.0314380429262547, 0.00784895693036568, 0.0070431286346795035, 0.0005471298572363542, 0.0005515113916336626, 0.0005690179985151272, 0.0010103286156502066, 0.017387111583431397, 0.007370851829990582, 0.0049869035565359085, 0.0007776299187582395, 0.0007776299187582395, 0.0012887771262151252, 0.001857225890835082, 0.0009493030239446788, 0.0011043364989134503, 0.0011246632984275567, 0.001654204241647626, 0.0011258216368682762, 0.0011775259274560768, 0.0013620180731890171, 0.0016690393946290458, 0.0017056807317018517, 0.0017087584074367635, 0.0018285219827627454, 0.002479801963801864, 0.002806961148531157, 0.002997142430798155, 0.004853774558581348, 0.007311790524685545],</w:t>
+      </w:r>
+    </w:p>
+    <w:p>
+      <w:r>
+        <w:t xml:space="preserve">  "AKs": </w:t>
+      </w:r>
+      <w:proofErr w:type="spellStart"/>
+      <w:r>
+        <w:t>Array.from</w:t>
+      </w:r>
+      <w:proofErr w:type="spellEnd"/>
+      <w:r>
+        <w:t xml:space="preserve">({length: 100}, (_, </w:t>
+      </w:r>
+      <w:proofErr w:type="spellStart"/>
+      <w:r>
+        <w:t>i</w:t>
+      </w:r>
+      <w:proofErr w:type="spellEnd"/>
+      <w:r>
+        <w:t xml:space="preserve">) =&gt; </w:t>
+      </w:r>
+      <w:proofErr w:type="spellStart"/>
+      <w:r>
+        <w:t>Math.random</w:t>
+      </w:r>
+      <w:proofErr w:type="spellEnd"/>
+      <w:r>
+        <w:t>() * 0.1),</w:t>
+      </w:r>
+    </w:p>
+    <w:p>
+      <w:r>
+        <w:t xml:space="preserve">  "</w:t>
+      </w:r>
+      <w:proofErr w:type="spellStart"/>
+      <w:r>
+        <w:t>AKo</w:t>
+      </w:r>
+      <w:proofErr w:type="spellEnd"/>
+      <w:r>
+        <w:t xml:space="preserve">": </w:t>
+      </w:r>
+      <w:proofErr w:type="spellStart"/>
+      <w:r>
+        <w:t>Array.from</w:t>
+      </w:r>
+      <w:proofErr w:type="spellEnd"/>
+      <w:r>
+        <w:t xml:space="preserve">({length: 100}, (_, </w:t>
+      </w:r>
+      <w:proofErr w:type="spellStart"/>
+      <w:r>
+        <w:t>i</w:t>
+      </w:r>
+      <w:proofErr w:type="spellEnd"/>
+      <w:r>
+        <w:t xml:space="preserve">) =&gt; </w:t>
+      </w:r>
+      <w:proofErr w:type="spellStart"/>
+      <w:r>
+        <w:t>Math.random</w:t>
+      </w:r>
+      <w:proofErr w:type="spellEnd"/>
+      <w:r>
+        <w:t>() * 0.08),</w:t>
+      </w:r>
+    </w:p>
+    <w:p>
+      <w:r>
+        <w:t xml:space="preserve">  "QQ": </w:t>
+      </w:r>
+      <w:proofErr w:type="spellStart"/>
+      <w:r>
+        <w:t>Array.from</w:t>
+      </w:r>
+      <w:proofErr w:type="spellEnd"/>
+      <w:r>
+        <w:t xml:space="preserve">({length: 100}, (_, </w:t>
+      </w:r>
+      <w:proofErr w:type="spellStart"/>
+      <w:r>
+        <w:t>i</w:t>
+      </w:r>
+      <w:proofErr w:type="spellEnd"/>
+      <w:r>
+        <w:t xml:space="preserve">) =&gt; </w:t>
+      </w:r>
+      <w:proofErr w:type="spellStart"/>
+      <w:r>
+        <w:t>Math.random</w:t>
+      </w:r>
+      <w:proofErr w:type="spellEnd"/>
+      <w:r>
+        <w:t>() * 0.12),</w:t>
+      </w:r>
+    </w:p>
+    <w:p>
+      <w:r>
+        <w:t>};</w:t>
+      </w:r>
+    </w:p>
+    <w:p/>
+    <w:p>
+      <w:proofErr w:type="spellStart"/>
+      <w:r>
+        <w:t>const</w:t>
+      </w:r>
+      <w:proofErr w:type="spellEnd"/>
+      <w:r>
+        <w:t xml:space="preserve"> HAND_GRID = [</w:t>
+      </w:r>
+    </w:p>
+    <w:p>
+      <w:r>
+        <w:t xml:space="preserve">  ['AA', 'AKs', 'AQs', 'AJs', 'ATs', 'A9s', 'A8s', 'A7s', 'A6s', 'A5s', 'A4s', 'A3s', 'A2s'],</w:t>
+      </w:r>
+    </w:p>
+    <w:p>
+      <w:r>
+        <w:t xml:space="preserve">  ['</w:t>
+      </w:r>
+      <w:proofErr w:type="spellStart"/>
+      <w:r>
+        <w:t>AKo</w:t>
+      </w:r>
+      <w:proofErr w:type="spellEnd"/>
+      <w:r>
+        <w:t>', 'KK', 'KQs', 'KJs', 'KTs', 'K9s', 'K8s', 'K7s', 'K6s', 'K5s', 'K4s', 'K3s', 'K2s'],</w:t>
+      </w:r>
+    </w:p>
+    <w:p>
+      <w:r>
+        <w:t xml:space="preserve">  ['</w:t>
+      </w:r>
+      <w:proofErr w:type="spellStart"/>
+      <w:r>
+        <w:t>AQo</w:t>
+      </w:r>
+      <w:proofErr w:type="spellEnd"/>
+      <w:r>
+        <w:t>', '</w:t>
+      </w:r>
+      <w:proofErr w:type="spellStart"/>
+      <w:r>
+        <w:t>KQo</w:t>
+      </w:r>
+      <w:proofErr w:type="spellEnd"/>
+      <w:r>
+        <w:t>', 'QQ', 'QJs', 'QTs', 'Q9s', 'Q8s', 'Q7s', 'Q6s', 'Q5s', 'Q4s', 'Q3s', 'Q2s'],</w:t>
+      </w:r>
+    </w:p>
+    <w:p>
+      <w:r>
+        <w:t xml:space="preserve">  ['AJo', '</w:t>
+      </w:r>
+      <w:proofErr w:type="spellStart"/>
+      <w:r>
+        <w:t>KJo</w:t>
+      </w:r>
+      <w:proofErr w:type="spellEnd"/>
+      <w:r>
+        <w:t>', '</w:t>
+      </w:r>
+      <w:proofErr w:type="spellStart"/>
+      <w:r>
+        <w:t>QJo</w:t>
+      </w:r>
+      <w:proofErr w:type="spellEnd"/>
+      <w:r>
+        <w:t>', 'JJ', 'JTs', 'J9s', 'J8s', 'J7s', 'J6s', 'J5s', 'J4s', 'J3s', 'J2s'],</w:t>
+      </w:r>
+    </w:p>
+    <w:p>
+      <w:r>
+        <w:t xml:space="preserve">  ['</w:t>
+      </w:r>
+      <w:proofErr w:type="spellStart"/>
+      <w:r>
+        <w:t>ATo</w:t>
+      </w:r>
+      <w:proofErr w:type="spellEnd"/>
+      <w:r>
+        <w:t>', '</w:t>
+      </w:r>
+      <w:proofErr w:type="spellStart"/>
+      <w:r>
+        <w:t>KTo</w:t>
+      </w:r>
+      <w:proofErr w:type="spellEnd"/>
+      <w:r>
+        <w:t>', '</w:t>
+      </w:r>
+      <w:proofErr w:type="spellStart"/>
+      <w:r>
+        <w:t>QTo</w:t>
+      </w:r>
+      <w:proofErr w:type="spellEnd"/>
+      <w:r>
+        <w:t>', '</w:t>
+      </w:r>
+      <w:proofErr w:type="spellStart"/>
+      <w:r>
+        <w:t>JTo</w:t>
+      </w:r>
+      <w:proofErr w:type="spellEnd"/>
+      <w:r>
+        <w:t>', 'TT', 'T9s', 'T8s', 'T7s', 'T6s', 'T5s', 'T4s', 'T3s', 'T2s'],</w:t>
+      </w:r>
+    </w:p>
+    <w:p>
+      <w:r>
+        <w:t xml:space="preserve">  ['A9o', 'K9o', 'Q9o', 'J9o', 'T9o', '99', '98s', '97s', '96s', '95s', '94s', '93s', '92s'],</w:t>
+      </w:r>
+    </w:p>
+    <w:p>
+      <w:r>
+        <w:t xml:space="preserve">  ['A8o', 'K8o', 'Q8o', 'J8o', 'T8o', '98o', '88', '87s', '86s', '85s', '84s', '83s', '82s'],</w:t>
+      </w:r>
+    </w:p>
+    <w:p>
+      <w:r>
+        <w:t xml:space="preserve">  ['A7o', 'K7o', 'Q7o', 'J7o', 'T7o', '97o', '86o', '77', '76s', '75s', '74s', '73s', '72s'],</w:t>
+      </w:r>
+    </w:p>
+    <w:p>
+      <w:r>
+        <w:t xml:space="preserve">  ['A6o', 'K6o', 'Q6o', 'J6o', 'T6o', '96o', '85o', '76o', '66', '65s', '64s', '63s', '62s'],</w:t>
+      </w:r>
+    </w:p>
+    <w:p>
+      <w:r>
+        <w:t xml:space="preserve">  ['A5o', 'K5o', 'Q5o', 'J5o', 'T5o', '95o', '84o', '75o', '65o', '55', '54s', '53s', '52s'],</w:t>
+      </w:r>
+    </w:p>
+    <w:p>
+      <w:r>
+        <w:t xml:space="preserve">  ['A4o', 'K4o', 'Q4o', 'J4o', 'T4o', '94o', '83o', '74o', '64o', '54o', '44', '43s', '42s'],</w:t>
+      </w:r>
+    </w:p>
+    <w:p>
+      <w:r>
+        <w:t xml:space="preserve">  ['A3o', 'K3o', 'Q3o', 'J3o', 'T3o', '93o', '82o', '73o', '63o', '53o', '43o', '33', '32s'],</w:t>
+      </w:r>
+    </w:p>
+    <w:p>
+      <w:r>
+        <w:t xml:space="preserve">  ['A2o', 'K2o', 'Q2o', 'J2o', 'T2o', '92o', '82o', '72o', '62o', '52o', '42o', '32o', '22']</w:t>
+      </w:r>
+    </w:p>
+    <w:p>
+      <w:r>
+        <w:t>];</w:t>
+      </w:r>
+    </w:p>
+    <w:p/>
+    <w:p>
+      <w:proofErr w:type="spellStart"/>
+      <w:r>
+        <w:t>const</w:t>
+      </w:r>
+      <w:proofErr w:type="spellEnd"/>
+      <w:r>
+        <w:t xml:space="preserve"> modes = ['Compare', 'Range', 'Cumulative'];</w:t>
+      </w:r>
+    </w:p>
+    <w:p>
+      <w:proofErr w:type="spellStart"/>
+      <w:r>
+        <w:t>const</w:t>
+      </w:r>
+      <w:proofErr w:type="spellEnd"/>
+      <w:r>
+        <w:t xml:space="preserve"> </w:t>
+      </w:r>
+      <w:proofErr w:type="spellStart"/>
+      <w:r>
+        <w:t>colors</w:t>
+      </w:r>
+      <w:proofErr w:type="spellEnd"/>
+      <w:r>
+        <w:t xml:space="preserve"> = ['#8884d8', '#82ca9d', '#ffc658', '#ff7c7c'];</w:t>
+      </w:r>
+    </w:p>
+    <w:p/>
+    <w:p>
+      <w:proofErr w:type="spellStart"/>
+      <w:r>
+        <w:t>const</w:t>
+      </w:r>
+      <w:proofErr w:type="spellEnd"/>
+      <w:r>
+        <w:t xml:space="preserve"> </w:t>
+      </w:r>
+      <w:proofErr w:type="spellStart"/>
+      <w:r>
+        <w:t>PokerHandAnalyzer</w:t>
+      </w:r>
+      <w:proofErr w:type="spellEnd"/>
+      <w:r>
+        <w:t xml:space="preserve"> = () =&gt; {</w:t>
+      </w:r>
+    </w:p>
+    <w:p>
+      <w:r>
+        <w:t xml:space="preserve">  </w:t>
+      </w:r>
+      <w:proofErr w:type="spellStart"/>
+      <w:r>
+        <w:t>const</w:t>
+      </w:r>
+      <w:proofErr w:type="spellEnd"/>
+      <w:r>
+        <w:t xml:space="preserve"> [</w:t>
+      </w:r>
+      <w:proofErr w:type="spellStart"/>
+      <w:r>
+        <w:t>selectedHands</w:t>
+      </w:r>
+      <w:proofErr w:type="spellEnd"/>
+      <w:r>
+        <w:t xml:space="preserve">, </w:t>
+      </w:r>
+      <w:proofErr w:type="spellStart"/>
+      <w:r>
+        <w:t>setSelectedHands</w:t>
+      </w:r>
+      <w:proofErr w:type="spellEnd"/>
+      <w:r>
+        <w:t xml:space="preserve">] = </w:t>
+      </w:r>
+      <w:proofErr w:type="spellStart"/>
+      <w:proofErr w:type="gramStart"/>
+      <w:r>
+        <w:t>useState</w:t>
+      </w:r>
+      <w:proofErr w:type="spellEnd"/>
+      <w:r>
+        <w:t>(</w:t>
+      </w:r>
+      <w:proofErr w:type="gramEnd"/>
+      <w:r>
+        <w:t>[]);</w:t>
+      </w:r>
+    </w:p>
+    <w:p>
+      <w:r>
+        <w:t xml:space="preserve">  </w:t>
+      </w:r>
+      <w:proofErr w:type="spellStart"/>
+      <w:r>
+        <w:t>const</w:t>
+      </w:r>
+      <w:proofErr w:type="spellEnd"/>
+      <w:r>
+        <w:t xml:space="preserve"> [</w:t>
+      </w:r>
+      <w:proofErr w:type="spellStart"/>
+      <w:r>
+        <w:t>currentMode</w:t>
+      </w:r>
+      <w:proofErr w:type="spellEnd"/>
+      <w:r>
+        <w:t xml:space="preserve">, </w:t>
+      </w:r>
+      <w:proofErr w:type="spellStart"/>
+      <w:r>
+        <w:t>setCurrentMode</w:t>
+      </w:r>
+      <w:proofErr w:type="spellEnd"/>
+      <w:r>
+        <w:t xml:space="preserve">] = </w:t>
+      </w:r>
+      <w:proofErr w:type="spellStart"/>
+      <w:r>
+        <w:t>useState</w:t>
+      </w:r>
+      <w:proofErr w:type="spellEnd"/>
+      <w:r>
+        <w:t>('Compare');</w:t>
+      </w:r>
+    </w:p>
+    <w:p/>
+    <w:p>
+      <w:r>
+        <w:t xml:space="preserve">  </w:t>
+      </w:r>
+      <w:proofErr w:type="spellStart"/>
+      <w:r>
+        <w:t>const</w:t>
+      </w:r>
+      <w:proofErr w:type="spellEnd"/>
+      <w:r>
+        <w:t xml:space="preserve"> </w:t>
+      </w:r>
+      <w:proofErr w:type="spellStart"/>
+      <w:r>
+        <w:t>toggleHandSelection</w:t>
+      </w:r>
+      <w:proofErr w:type="spellEnd"/>
+      <w:r>
+        <w:t xml:space="preserve"> = (hand) =&gt; {</w:t>
+      </w:r>
+    </w:p>
+    <w:p>
+      <w:r>
+        <w:t xml:space="preserve">    </w:t>
+      </w:r>
+      <w:proofErr w:type="spellStart"/>
+      <w:proofErr w:type="gramStart"/>
+      <w:r>
+        <w:t>setSelectedHands</w:t>
+      </w:r>
+      <w:proofErr w:type="spellEnd"/>
+      <w:r>
+        <w:t>(</w:t>
+      </w:r>
+      <w:proofErr w:type="spellStart"/>
+      <w:proofErr w:type="gramEnd"/>
+      <w:r>
+        <w:t>prev</w:t>
+      </w:r>
+      <w:proofErr w:type="spellEnd"/>
+      <w:r>
+        <w:t xml:space="preserve"> =&gt; {</w:t>
+      </w:r>
+    </w:p>
+    <w:p>
+      <w:r>
+        <w:t xml:space="preserve">      if (</w:t>
+      </w:r>
+      <w:proofErr w:type="spellStart"/>
+      <w:proofErr w:type="gramStart"/>
+      <w:r>
+        <w:t>prev.includes</w:t>
+      </w:r>
+      <w:proofErr w:type="spellEnd"/>
+      <w:proofErr w:type="gramEnd"/>
+      <w:r>
+        <w:t>(hand)) {</w:t>
+      </w:r>
+    </w:p>
+    <w:p>
+      <w:r>
+        <w:t xml:space="preserve">        return </w:t>
+      </w:r>
+      <w:proofErr w:type="spellStart"/>
+      <w:proofErr w:type="gramStart"/>
+      <w:r>
+        <w:t>prev.filter</w:t>
+      </w:r>
+      <w:proofErr w:type="spellEnd"/>
+      <w:proofErr w:type="gramEnd"/>
+      <w:r>
+        <w:t xml:space="preserve">(h =&gt; </w:t>
+      </w:r>
+      <w:proofErr w:type="gramStart"/>
+      <w:r>
+        <w:t>h !</w:t>
+      </w:r>
+      <w:proofErr w:type="gramEnd"/>
+      <w:r>
+        <w:t>== hand);</w:t>
+      </w:r>
+    </w:p>
+    <w:p>
+      <w:r>
+        <w:t xml:space="preserve">      } else {</w:t>
+      </w:r>
+    </w:p>
+    <w:p>
+      <w:r>
+        <w:t xml:space="preserve">        if (</w:t>
+      </w:r>
+      <w:proofErr w:type="spellStart"/>
+      <w:r>
+        <w:t>currentMode</w:t>
+      </w:r>
+      <w:proofErr w:type="spellEnd"/>
+      <w:r>
+        <w:t xml:space="preserve"> === 'Compare' &amp;&amp; </w:t>
+      </w:r>
+      <w:proofErr w:type="spellStart"/>
+      <w:proofErr w:type="gramStart"/>
+      <w:r>
+        <w:t>prev.length</w:t>
+      </w:r>
+      <w:proofErr w:type="spellEnd"/>
+      <w:proofErr w:type="gramEnd"/>
+      <w:r>
+        <w:t xml:space="preserve"> &gt;= 4) {</w:t>
+      </w:r>
+    </w:p>
+    <w:p>
+      <w:r>
+        <w:t xml:space="preserve">          return </w:t>
+      </w:r>
+      <w:proofErr w:type="spellStart"/>
+      <w:r>
+        <w:t>prev</w:t>
+      </w:r>
+      <w:proofErr w:type="spellEnd"/>
+      <w:r>
+        <w:t>; // Limit to 4 hands in compare mode</w:t>
+      </w:r>
+    </w:p>
+    <w:p>
+      <w:r>
+        <w:lastRenderedPageBreak/>
+        <w:t xml:space="preserve">        }</w:t>
+      </w:r>
+    </w:p>
+    <w:p>
+      <w:r>
+        <w:t xml:space="preserve">        return [...</w:t>
+      </w:r>
+      <w:proofErr w:type="spellStart"/>
+      <w:r>
+        <w:t>prev</w:t>
+      </w:r>
+      <w:proofErr w:type="spellEnd"/>
+      <w:r>
+        <w:t>, hand];</w:t>
+      </w:r>
+    </w:p>
+    <w:p>
+      <w:r>
+        <w:t xml:space="preserve">      }</w:t>
+      </w:r>
+    </w:p>
+    <w:p>
+      <w:r>
+        <w:t xml:space="preserve">    });</w:t>
+      </w:r>
+    </w:p>
+    <w:p>
+      <w:r>
+        <w:t xml:space="preserve">  };</w:t>
+      </w:r>
+    </w:p>
+    <w:p/>
+    <w:p>
+      <w:r>
+        <w:t xml:space="preserve">  </w:t>
+      </w:r>
+      <w:proofErr w:type="spellStart"/>
+      <w:r>
+        <w:t>const</w:t>
+      </w:r>
+      <w:proofErr w:type="spellEnd"/>
+      <w:r>
+        <w:t xml:space="preserve"> </w:t>
+      </w:r>
+      <w:proofErr w:type="spellStart"/>
+      <w:r>
+        <w:t>getHandStyle</w:t>
+      </w:r>
+      <w:proofErr w:type="spellEnd"/>
+      <w:r>
+        <w:t xml:space="preserve"> = (hand) =&gt; {</w:t>
+      </w:r>
+    </w:p>
+    <w:p>
+      <w:r>
+        <w:t xml:space="preserve">    </w:t>
+      </w:r>
+      <w:proofErr w:type="spellStart"/>
+      <w:r>
+        <w:t>const</w:t>
+      </w:r>
+      <w:proofErr w:type="spellEnd"/>
+      <w:r>
+        <w:t xml:space="preserve"> </w:t>
+      </w:r>
+      <w:proofErr w:type="spellStart"/>
+      <w:r>
+        <w:t>isSelected</w:t>
+      </w:r>
+      <w:proofErr w:type="spellEnd"/>
+      <w:r>
+        <w:t xml:space="preserve"> = </w:t>
+      </w:r>
+      <w:proofErr w:type="spellStart"/>
+      <w:r>
+        <w:t>selectedHands.includes</w:t>
+      </w:r>
+      <w:proofErr w:type="spellEnd"/>
+      <w:r>
+        <w:t>(hand);</w:t>
+      </w:r>
+    </w:p>
+    <w:p>
+      <w:r>
+        <w:t xml:space="preserve">    </w:t>
+      </w:r>
+      <w:proofErr w:type="spellStart"/>
+      <w:r>
+        <w:t>const</w:t>
+      </w:r>
+      <w:proofErr w:type="spellEnd"/>
+      <w:r>
+        <w:t xml:space="preserve"> </w:t>
+      </w:r>
+      <w:proofErr w:type="spellStart"/>
+      <w:r>
+        <w:t>isPair</w:t>
+      </w:r>
+      <w:proofErr w:type="spellEnd"/>
+      <w:r>
+        <w:t xml:space="preserve"> = </w:t>
+      </w:r>
+      <w:proofErr w:type="gramStart"/>
+      <w:r>
+        <w:t>hand[</w:t>
+      </w:r>
+      <w:proofErr w:type="gramEnd"/>
+      <w:r>
+        <w:t xml:space="preserve">0] === </w:t>
+      </w:r>
+      <w:proofErr w:type="gramStart"/>
+      <w:r>
+        <w:t>hand[</w:t>
+      </w:r>
+      <w:proofErr w:type="gramEnd"/>
+      <w:r>
+        <w:t>1];</w:t>
+      </w:r>
+    </w:p>
+    <w:p>
+      <w:r>
+        <w:t xml:space="preserve">    </w:t>
+      </w:r>
+      <w:proofErr w:type="spellStart"/>
+      <w:r>
+        <w:t>const</w:t>
+      </w:r>
+      <w:proofErr w:type="spellEnd"/>
+      <w:r>
+        <w:t xml:space="preserve"> </w:t>
+      </w:r>
+      <w:proofErr w:type="spellStart"/>
+      <w:r>
+        <w:t>isSuited</w:t>
+      </w:r>
+      <w:proofErr w:type="spellEnd"/>
+      <w:r>
+        <w:t xml:space="preserve"> = </w:t>
+      </w:r>
+      <w:proofErr w:type="spellStart"/>
+      <w:proofErr w:type="gramStart"/>
+      <w:r>
+        <w:t>hand.includes</w:t>
+      </w:r>
+      <w:proofErr w:type="spellEnd"/>
+      <w:proofErr w:type="gramEnd"/>
+      <w:r>
+        <w:t>('s');</w:t>
+      </w:r>
+    </w:p>
+    <w:p>
+      <w:r>
+        <w:t xml:space="preserve">    </w:t>
+      </w:r>
+    </w:p>
+    <w:p>
+      <w:r>
+        <w:t xml:space="preserve">    let </w:t>
+      </w:r>
+      <w:proofErr w:type="spellStart"/>
+      <w:r>
+        <w:t>baseColor</w:t>
+      </w:r>
+      <w:proofErr w:type="spellEnd"/>
+      <w:r>
+        <w:t xml:space="preserve"> = '#dc2626'; // Red for </w:t>
+      </w:r>
+      <w:proofErr w:type="spellStart"/>
+      <w:r>
+        <w:t>offsuit</w:t>
+      </w:r>
+      <w:proofErr w:type="spellEnd"/>
+    </w:p>
+    <w:p>
+      <w:r>
+        <w:t xml:space="preserve">    if (</w:t>
+      </w:r>
+      <w:proofErr w:type="spellStart"/>
+      <w:r>
+        <w:t>isPair</w:t>
+      </w:r>
+      <w:proofErr w:type="spellEnd"/>
+      <w:r>
+        <w:t xml:space="preserve">) </w:t>
+      </w:r>
+      <w:proofErr w:type="spellStart"/>
+      <w:r>
+        <w:t>baseColor</w:t>
+      </w:r>
+      <w:proofErr w:type="spellEnd"/>
+      <w:r>
+        <w:t xml:space="preserve"> = '#dc2626'; // Red for pairs</w:t>
+      </w:r>
+    </w:p>
+    <w:p>
+      <w:r>
+        <w:t xml:space="preserve">    else if (</w:t>
+      </w:r>
+      <w:proofErr w:type="spellStart"/>
+      <w:r>
+        <w:t>isSuited</w:t>
+      </w:r>
+      <w:proofErr w:type="spellEnd"/>
+      <w:r>
+        <w:t xml:space="preserve">) </w:t>
+      </w:r>
+      <w:proofErr w:type="spellStart"/>
+      <w:r>
+        <w:t>baseColor</w:t>
+      </w:r>
+      <w:proofErr w:type="spellEnd"/>
+      <w:r>
+        <w:t xml:space="preserve"> = '#16a34a'; // Green for suited</w:t>
+      </w:r>
+    </w:p>
+    <w:p>
+      <w:r>
+        <w:t xml:space="preserve">    </w:t>
+      </w:r>
+    </w:p>
+    <w:p>
+      <w:r>
+        <w:t xml:space="preserve">    return {</w:t>
+      </w:r>
+    </w:p>
+    <w:p>
+      <w:r>
+        <w:t xml:space="preserve">      </w:t>
+      </w:r>
+      <w:proofErr w:type="spellStart"/>
+      <w:r>
+        <w:t>backgroundColor</w:t>
+      </w:r>
+      <w:proofErr w:type="spellEnd"/>
+      <w:r>
+        <w:t xml:space="preserve">: </w:t>
+      </w:r>
+      <w:proofErr w:type="spellStart"/>
+      <w:proofErr w:type="gramStart"/>
+      <w:r>
+        <w:t>isSelected</w:t>
+      </w:r>
+      <w:proofErr w:type="spellEnd"/>
+      <w:r>
+        <w:t xml:space="preserve"> ?</w:t>
+      </w:r>
+      <w:proofErr w:type="gramEnd"/>
+      <w:r>
+        <w:t xml:space="preserve"> '#1f2937</w:t>
+      </w:r>
+      <w:proofErr w:type="gramStart"/>
+      <w:r>
+        <w:t>' :</w:t>
+      </w:r>
+      <w:proofErr w:type="gramEnd"/>
+      <w:r>
+        <w:t xml:space="preserve"> </w:t>
+      </w:r>
+      <w:proofErr w:type="spellStart"/>
+      <w:r>
+        <w:t>baseColor</w:t>
+      </w:r>
+      <w:proofErr w:type="spellEnd"/>
+      <w:r>
+        <w:t>,</w:t>
+      </w:r>
+    </w:p>
+    <w:p>
+      <w:r>
+        <w:t xml:space="preserve">      </w:t>
+      </w:r>
+      <w:proofErr w:type="spellStart"/>
+      <w:r>
+        <w:t>color</w:t>
+      </w:r>
+      <w:proofErr w:type="spellEnd"/>
+      <w:r>
+        <w:t>: 'white',</w:t>
+      </w:r>
+    </w:p>
+    <w:p>
+      <w:r>
+        <w:t xml:space="preserve">      border: </w:t>
+      </w:r>
+      <w:proofErr w:type="spellStart"/>
+      <w:proofErr w:type="gramStart"/>
+      <w:r>
+        <w:t>isSelected</w:t>
+      </w:r>
+      <w:proofErr w:type="spellEnd"/>
+      <w:r>
+        <w:t xml:space="preserve"> ?</w:t>
+      </w:r>
+      <w:proofErr w:type="gramEnd"/>
+      <w:r>
+        <w:t xml:space="preserve"> '3px solid #fbbf24</w:t>
+      </w:r>
+      <w:proofErr w:type="gramStart"/>
+      <w:r>
+        <w:t>' :</w:t>
+      </w:r>
+      <w:proofErr w:type="gramEnd"/>
+      <w:r>
+        <w:t xml:space="preserve"> '1px solid #374151',</w:t>
+      </w:r>
+    </w:p>
+    <w:p>
+      <w:r>
+        <w:t xml:space="preserve">      cursor: 'pointer',</w:t>
+      </w:r>
+    </w:p>
+    <w:p>
+      <w:r>
+        <w:t xml:space="preserve">      padding: '8px',</w:t>
+      </w:r>
+    </w:p>
+    <w:p>
+      <w:r>
+        <w:t xml:space="preserve">      </w:t>
+      </w:r>
+      <w:proofErr w:type="spellStart"/>
+      <w:r>
+        <w:t>textAlign</w:t>
+      </w:r>
+      <w:proofErr w:type="spellEnd"/>
+      <w:r>
+        <w:t>: '</w:t>
+      </w:r>
+      <w:proofErr w:type="spellStart"/>
+      <w:r>
+        <w:t>center</w:t>
+      </w:r>
+      <w:proofErr w:type="spellEnd"/>
+      <w:r>
+        <w:t>',</w:t>
+      </w:r>
+    </w:p>
+    <w:p>
+      <w:r>
+        <w:t xml:space="preserve">      </w:t>
+      </w:r>
+      <w:proofErr w:type="spellStart"/>
+      <w:r>
+        <w:t>fontSize</w:t>
+      </w:r>
+      <w:proofErr w:type="spellEnd"/>
+      <w:r>
+        <w:t>: '12px',</w:t>
+      </w:r>
+    </w:p>
+    <w:p>
+      <w:r>
+        <w:t xml:space="preserve">      </w:t>
+      </w:r>
+      <w:proofErr w:type="spellStart"/>
+      <w:r>
+        <w:t>fontWeight</w:t>
+      </w:r>
+      <w:proofErr w:type="spellEnd"/>
+      <w:r>
+        <w:t>: 'bold',</w:t>
+      </w:r>
+    </w:p>
+    <w:p>
+      <w:r>
+        <w:t xml:space="preserve">      transition: 'all 0.2s',</w:t>
+      </w:r>
+    </w:p>
+    <w:p>
+      <w:r>
+        <w:t xml:space="preserve">      opacity: </w:t>
+      </w:r>
+      <w:proofErr w:type="spellStart"/>
+      <w:proofErr w:type="gramStart"/>
+      <w:r>
+        <w:t>isSelected</w:t>
+      </w:r>
+      <w:proofErr w:type="spellEnd"/>
+      <w:r>
+        <w:t xml:space="preserve"> ?</w:t>
+      </w:r>
+      <w:proofErr w:type="gramEnd"/>
+      <w:r>
+        <w:t xml:space="preserve"> </w:t>
+      </w:r>
+      <w:proofErr w:type="gramStart"/>
+      <w:r>
+        <w:t>1 :</w:t>
+      </w:r>
+      <w:proofErr w:type="gramEnd"/>
+      <w:r>
+        <w:t xml:space="preserve"> 0.8,</w:t>
+      </w:r>
+    </w:p>
+    <w:p>
+      <w:r>
+        <w:t xml:space="preserve">    };</w:t>
+      </w:r>
+    </w:p>
+    <w:p>
+      <w:r>
+        <w:t xml:space="preserve">  };</w:t>
+      </w:r>
+    </w:p>
+    <w:p/>
+    <w:p>
+      <w:r>
+        <w:t xml:space="preserve">  </w:t>
+      </w:r>
+      <w:proofErr w:type="spellStart"/>
+      <w:r>
+        <w:t>const</w:t>
+      </w:r>
+      <w:proofErr w:type="spellEnd"/>
+      <w:r>
+        <w:t xml:space="preserve"> </w:t>
+      </w:r>
+      <w:proofErr w:type="spellStart"/>
+      <w:r>
+        <w:t>chartData</w:t>
+      </w:r>
+      <w:proofErr w:type="spellEnd"/>
+      <w:r>
+        <w:t xml:space="preserve"> = </w:t>
+      </w:r>
+      <w:proofErr w:type="spellStart"/>
+      <w:proofErr w:type="gramStart"/>
+      <w:r>
+        <w:t>useMemo</w:t>
+      </w:r>
+      <w:proofErr w:type="spellEnd"/>
+      <w:r>
+        <w:t>(</w:t>
+      </w:r>
+      <w:proofErr w:type="gramEnd"/>
+      <w:r>
+        <w:t>() =&gt; {</w:t>
+      </w:r>
+    </w:p>
+    <w:p>
+      <w:r>
+        <w:t xml:space="preserve">    if </w:t>
+      </w:r>
+      <w:proofErr w:type="gramStart"/>
+      <w:r>
+        <w:t>(!</w:t>
+      </w:r>
+      <w:proofErr w:type="spellStart"/>
+      <w:r>
+        <w:t>selectedHands.length</w:t>
+      </w:r>
+      <w:proofErr w:type="spellEnd"/>
+      <w:proofErr w:type="gramEnd"/>
+      <w:r>
+        <w:t>) return [];</w:t>
+      </w:r>
+    </w:p>
+    <w:p>
+      <w:r>
+        <w:lastRenderedPageBreak/>
+        <w:t xml:space="preserve">    </w:t>
+      </w:r>
+    </w:p>
+    <w:p>
+      <w:r>
+        <w:t xml:space="preserve">    return </w:t>
+      </w:r>
+      <w:proofErr w:type="spellStart"/>
+      <w:r>
+        <w:t>Array.from</w:t>
+      </w:r>
+      <w:proofErr w:type="spellEnd"/>
+      <w:r>
+        <w:t xml:space="preserve">({length: 100}, (_, </w:t>
+      </w:r>
+      <w:proofErr w:type="spellStart"/>
+      <w:r>
+        <w:t>i</w:t>
+      </w:r>
+      <w:proofErr w:type="spellEnd"/>
+      <w:r>
+        <w:t>) =&gt; {</w:t>
+      </w:r>
+    </w:p>
+    <w:p>
+      <w:r>
+        <w:t xml:space="preserve">      </w:t>
+      </w:r>
+      <w:proofErr w:type="spellStart"/>
+      <w:r>
+        <w:t>const</w:t>
+      </w:r>
+      <w:proofErr w:type="spellEnd"/>
+      <w:r>
+        <w:t xml:space="preserve"> </w:t>
+      </w:r>
+      <w:proofErr w:type="spellStart"/>
+      <w:r>
+        <w:t>dataPoint</w:t>
+      </w:r>
+      <w:proofErr w:type="spellEnd"/>
+      <w:r>
+        <w:t xml:space="preserve"> = </w:t>
+      </w:r>
+      <w:proofErr w:type="gramStart"/>
+      <w:r>
+        <w:t>{ bucket</w:t>
+      </w:r>
+      <w:proofErr w:type="gramEnd"/>
+      <w:r>
+        <w:t xml:space="preserve">: </w:t>
+      </w:r>
+      <w:proofErr w:type="spellStart"/>
+      <w:r>
+        <w:t>i</w:t>
+      </w:r>
+      <w:proofErr w:type="spellEnd"/>
+      <w:r>
+        <w:t xml:space="preserve"> + </w:t>
+      </w:r>
+      <w:proofErr w:type="gramStart"/>
+      <w:r>
+        <w:t>1 }</w:t>
+      </w:r>
+      <w:proofErr w:type="gramEnd"/>
+      <w:r>
+        <w:t>;</w:t>
+      </w:r>
+    </w:p>
+    <w:p>
+      <w:r>
+        <w:t xml:space="preserve">      </w:t>
+      </w:r>
+      <w:proofErr w:type="spellStart"/>
+      <w:r>
+        <w:t>selectedHands.forEach</w:t>
+      </w:r>
+      <w:proofErr w:type="spellEnd"/>
+      <w:r>
+        <w:t xml:space="preserve">((hand, </w:t>
+      </w:r>
+      <w:proofErr w:type="spellStart"/>
+      <w:r>
+        <w:t>idx</w:t>
+      </w:r>
+      <w:proofErr w:type="spellEnd"/>
+      <w:r>
+        <w:t>) =&gt; {</w:t>
+      </w:r>
+    </w:p>
+    <w:p>
+      <w:r>
+        <w:t xml:space="preserve">        if (</w:t>
+      </w:r>
+      <w:proofErr w:type="spellStart"/>
+      <w:r>
+        <w:t>mockHandData</w:t>
+      </w:r>
+      <w:proofErr w:type="spellEnd"/>
+      <w:r>
+        <w:t>[hand]) {</w:t>
+      </w:r>
+    </w:p>
+    <w:p>
+      <w:r>
+        <w:t xml:space="preserve">          </w:t>
+      </w:r>
+      <w:proofErr w:type="spellStart"/>
+      <w:r>
+        <w:t>dataPoint</w:t>
+      </w:r>
+      <w:proofErr w:type="spellEnd"/>
+      <w:r>
+        <w:t xml:space="preserve">[hand] = </w:t>
+      </w:r>
+      <w:proofErr w:type="spellStart"/>
+      <w:r>
+        <w:t>mockHandData</w:t>
+      </w:r>
+      <w:proofErr w:type="spellEnd"/>
+      <w:r>
+        <w:t>[hand][</w:t>
+      </w:r>
+      <w:proofErr w:type="spellStart"/>
+      <w:r>
+        <w:t>i</w:t>
+      </w:r>
+      <w:proofErr w:type="spellEnd"/>
+      <w:r>
+        <w:t>] || 0;</w:t>
+      </w:r>
+    </w:p>
+    <w:p>
+      <w:r>
+        <w:t xml:space="preserve">        }</w:t>
+      </w:r>
+    </w:p>
+    <w:p>
+      <w:r>
+        <w:t xml:space="preserve">      });</w:t>
+      </w:r>
+    </w:p>
+    <w:p>
+      <w:r>
+        <w:t xml:space="preserve">      return </w:t>
+      </w:r>
+      <w:proofErr w:type="spellStart"/>
+      <w:r>
+        <w:t>dataPoint</w:t>
+      </w:r>
+      <w:proofErr w:type="spellEnd"/>
+      <w:r>
+        <w:t>;</w:t>
+      </w:r>
+    </w:p>
+    <w:p>
+      <w:r>
+        <w:t xml:space="preserve">    });</w:t>
+      </w:r>
+    </w:p>
+    <w:p>
+      <w:r>
+        <w:t xml:space="preserve">  }, [</w:t>
+      </w:r>
+      <w:proofErr w:type="spellStart"/>
+      <w:r>
+        <w:t>selectedHands</w:t>
+      </w:r>
+      <w:proofErr w:type="spellEnd"/>
+      <w:r>
+        <w:t>]);</w:t>
+      </w:r>
+    </w:p>
+    <w:p/>
+    <w:p>
+      <w:r>
+        <w:t xml:space="preserve">  </w:t>
+      </w:r>
+      <w:proofErr w:type="spellStart"/>
+      <w:r>
+        <w:t>const</w:t>
+      </w:r>
+      <w:proofErr w:type="spellEnd"/>
+      <w:r>
+        <w:t xml:space="preserve"> </w:t>
+      </w:r>
+      <w:proofErr w:type="spellStart"/>
+      <w:r>
+        <w:t>cumulativeData</w:t>
+      </w:r>
+      <w:proofErr w:type="spellEnd"/>
+      <w:r>
+        <w:t xml:space="preserve"> = </w:t>
+      </w:r>
+      <w:proofErr w:type="spellStart"/>
+      <w:proofErr w:type="gramStart"/>
+      <w:r>
+        <w:t>useMemo</w:t>
+      </w:r>
+      <w:proofErr w:type="spellEnd"/>
+      <w:r>
+        <w:t>(</w:t>
+      </w:r>
+      <w:proofErr w:type="gramEnd"/>
+      <w:r>
+        <w:t>() =&gt; {</w:t>
+      </w:r>
+    </w:p>
+    <w:p>
+      <w:r>
+        <w:t xml:space="preserve">    if </w:t>
+      </w:r>
+      <w:proofErr w:type="gramStart"/>
+      <w:r>
+        <w:t>(!</w:t>
+      </w:r>
+      <w:proofErr w:type="spellStart"/>
+      <w:r>
+        <w:t>selectedHands.length</w:t>
+      </w:r>
+      <w:proofErr w:type="spellEnd"/>
+      <w:proofErr w:type="gramEnd"/>
+      <w:r>
+        <w:t>) return [];</w:t>
+      </w:r>
+    </w:p>
+    <w:p>
+      <w:r>
+        <w:t xml:space="preserve">    </w:t>
+      </w:r>
+    </w:p>
+    <w:p>
+      <w:r>
+        <w:t xml:space="preserve">    return </w:t>
+      </w:r>
+      <w:proofErr w:type="spellStart"/>
+      <w:r>
+        <w:t>Array.from</w:t>
+      </w:r>
+      <w:proofErr w:type="spellEnd"/>
+      <w:r>
+        <w:t xml:space="preserve">({length: 100}, (_, </w:t>
+      </w:r>
+      <w:proofErr w:type="spellStart"/>
+      <w:r>
+        <w:t>i</w:t>
+      </w:r>
+      <w:proofErr w:type="spellEnd"/>
+      <w:r>
+        <w:t>) =&gt; {</w:t>
+      </w:r>
+    </w:p>
+    <w:p>
+      <w:r>
+        <w:t xml:space="preserve">      </w:t>
+      </w:r>
+      <w:proofErr w:type="spellStart"/>
+      <w:r>
+        <w:t>const</w:t>
+      </w:r>
+      <w:proofErr w:type="spellEnd"/>
+      <w:r>
+        <w:t xml:space="preserve"> </w:t>
+      </w:r>
+      <w:proofErr w:type="spellStart"/>
+      <w:r>
+        <w:t>dataPoint</w:t>
+      </w:r>
+      <w:proofErr w:type="spellEnd"/>
+      <w:r>
+        <w:t xml:space="preserve"> = </w:t>
+      </w:r>
+      <w:proofErr w:type="gramStart"/>
+      <w:r>
+        <w:t>{ bucket</w:t>
+      </w:r>
+      <w:proofErr w:type="gramEnd"/>
+      <w:r>
+        <w:t xml:space="preserve">: </w:t>
+      </w:r>
+      <w:proofErr w:type="spellStart"/>
+      <w:r>
+        <w:t>i</w:t>
+      </w:r>
+      <w:proofErr w:type="spellEnd"/>
+      <w:r>
+        <w:t xml:space="preserve"> + </w:t>
+      </w:r>
+      <w:proofErr w:type="gramStart"/>
+      <w:r>
+        <w:t>1 }</w:t>
+      </w:r>
+      <w:proofErr w:type="gramEnd"/>
+      <w:r>
+        <w:t>;</w:t>
+      </w:r>
+    </w:p>
+    <w:p>
+      <w:r>
+        <w:t xml:space="preserve">      </w:t>
+      </w:r>
+      <w:proofErr w:type="spellStart"/>
+      <w:r>
+        <w:t>selectedHands.forEach</w:t>
+      </w:r>
+      <w:proofErr w:type="spellEnd"/>
+      <w:r>
+        <w:t>(hand =&gt; {</w:t>
+      </w:r>
+    </w:p>
+    <w:p>
+      <w:r>
+        <w:t xml:space="preserve">        if (</w:t>
+      </w:r>
+      <w:proofErr w:type="spellStart"/>
+      <w:r>
+        <w:t>mockHandData</w:t>
+      </w:r>
+      <w:proofErr w:type="spellEnd"/>
+      <w:r>
+        <w:t>[hand]) {</w:t>
+      </w:r>
+    </w:p>
+    <w:p>
+      <w:r>
+        <w:t xml:space="preserve">          </w:t>
+      </w:r>
+      <w:proofErr w:type="spellStart"/>
+      <w:r>
+        <w:t>const</w:t>
+      </w:r>
+      <w:proofErr w:type="spellEnd"/>
+      <w:r>
+        <w:t xml:space="preserve"> </w:t>
+      </w:r>
+      <w:proofErr w:type="spellStart"/>
+      <w:r>
+        <w:t>cumSum</w:t>
+      </w:r>
+      <w:proofErr w:type="spellEnd"/>
+      <w:r>
+        <w:t xml:space="preserve"> = </w:t>
+      </w:r>
+      <w:proofErr w:type="spellStart"/>
+      <w:r>
+        <w:t>mockHandData</w:t>
+      </w:r>
+      <w:proofErr w:type="spellEnd"/>
+      <w:r>
+        <w:t>[hand</w:t>
+      </w:r>
+      <w:proofErr w:type="gramStart"/>
+      <w:r>
+        <w:t>].slice</w:t>
+      </w:r>
+      <w:proofErr w:type="gramEnd"/>
+      <w:r>
+        <w:t xml:space="preserve">(0, </w:t>
+      </w:r>
+      <w:proofErr w:type="spellStart"/>
+      <w:r>
+        <w:t>i</w:t>
+      </w:r>
+      <w:proofErr w:type="spellEnd"/>
+      <w:r>
+        <w:t xml:space="preserve"> + 1</w:t>
+      </w:r>
+      <w:proofErr w:type="gramStart"/>
+      <w:r>
+        <w:t>).reduce</w:t>
+      </w:r>
+      <w:proofErr w:type="gramEnd"/>
+      <w:r>
+        <w:t xml:space="preserve">((sum, </w:t>
+      </w:r>
+      <w:proofErr w:type="spellStart"/>
+      <w:r>
+        <w:t>val</w:t>
+      </w:r>
+      <w:proofErr w:type="spellEnd"/>
+      <w:r>
+        <w:t xml:space="preserve">) =&gt; sum + </w:t>
+      </w:r>
+      <w:proofErr w:type="spellStart"/>
+      <w:r>
+        <w:t>val</w:t>
+      </w:r>
+      <w:proofErr w:type="spellEnd"/>
+      <w:r>
+        <w:t>, 0);</w:t>
+      </w:r>
+    </w:p>
+    <w:p>
+      <w:r>
+        <w:t xml:space="preserve">          </w:t>
+      </w:r>
+      <w:proofErr w:type="spellStart"/>
+      <w:r>
+        <w:t>dataPoint</w:t>
+      </w:r>
+      <w:proofErr w:type="spellEnd"/>
+      <w:r>
+        <w:t xml:space="preserve">[hand] = </w:t>
+      </w:r>
+      <w:proofErr w:type="spellStart"/>
+      <w:r>
+        <w:t>cumSum</w:t>
+      </w:r>
+      <w:proofErr w:type="spellEnd"/>
+      <w:r>
+        <w:t>;</w:t>
+      </w:r>
+    </w:p>
+    <w:p>
+      <w:r>
+        <w:t xml:space="preserve">        }</w:t>
+      </w:r>
+    </w:p>
+    <w:p>
+      <w:r>
+        <w:t xml:space="preserve">      });</w:t>
+      </w:r>
+    </w:p>
+    <w:p>
+      <w:r>
+        <w:t xml:space="preserve">      return </w:t>
+      </w:r>
+      <w:proofErr w:type="spellStart"/>
+      <w:r>
+        <w:t>dataPoint</w:t>
+      </w:r>
+      <w:proofErr w:type="spellEnd"/>
+      <w:r>
+        <w:t>;</w:t>
+      </w:r>
+    </w:p>
+    <w:p>
+      <w:r>
+        <w:t xml:space="preserve">    });</w:t>
+      </w:r>
+    </w:p>
+    <w:p>
+      <w:r>
+        <w:t xml:space="preserve">  }, [</w:t>
+      </w:r>
+      <w:proofErr w:type="spellStart"/>
+      <w:r>
+        <w:t>selectedHands</w:t>
+      </w:r>
+      <w:proofErr w:type="spellEnd"/>
+      <w:r>
+        <w:t>]);</w:t>
+      </w:r>
+    </w:p>
+    <w:p/>
+    <w:p>
+      <w:r>
+        <w:t xml:space="preserve">  </w:t>
+      </w:r>
+      <w:proofErr w:type="spellStart"/>
+      <w:r>
+        <w:t>const</w:t>
+      </w:r>
+      <w:proofErr w:type="spellEnd"/>
+      <w:r>
+        <w:t xml:space="preserve"> </w:t>
+      </w:r>
+      <w:proofErr w:type="spellStart"/>
+      <w:r>
+        <w:t>renderCompareMode</w:t>
+      </w:r>
+      <w:proofErr w:type="spellEnd"/>
+      <w:r>
+        <w:t xml:space="preserve"> = () =&gt; {</w:t>
+      </w:r>
+    </w:p>
+    <w:p>
+      <w:r>
+        <w:t xml:space="preserve">    </w:t>
+      </w:r>
+      <w:proofErr w:type="spellStart"/>
+      <w:r>
+        <w:t>const</w:t>
+      </w:r>
+      <w:proofErr w:type="spellEnd"/>
+      <w:r>
+        <w:t xml:space="preserve"> hands = </w:t>
+      </w:r>
+      <w:proofErr w:type="spellStart"/>
+      <w:r>
+        <w:t>selectedHands.slice</w:t>
+      </w:r>
+      <w:proofErr w:type="spellEnd"/>
+      <w:r>
+        <w:t>(0, 4);</w:t>
+      </w:r>
+    </w:p>
+    <w:p>
+      <w:r>
+        <w:t xml:space="preserve">    if (</w:t>
+      </w:r>
+      <w:proofErr w:type="spellStart"/>
+      <w:proofErr w:type="gramStart"/>
+      <w:r>
+        <w:t>hands.length</w:t>
+      </w:r>
+      <w:proofErr w:type="spellEnd"/>
+      <w:proofErr w:type="gramEnd"/>
+      <w:r>
+        <w:t xml:space="preserve"> === 0) {</w:t>
+      </w:r>
+    </w:p>
+    <w:p>
+      <w:r>
+        <w:t xml:space="preserve">      return (</w:t>
+      </w:r>
+    </w:p>
+    <w:p>
+      <w:r>
+        <w:lastRenderedPageBreak/>
+        <w:t xml:space="preserve">        &lt;div </w:t>
+      </w:r>
+      <w:proofErr w:type="spellStart"/>
+      <w:r>
+        <w:t>className</w:t>
+      </w:r>
+      <w:proofErr w:type="spellEnd"/>
+      <w:r>
+        <w:t>="flex items-</w:t>
+      </w:r>
+      <w:proofErr w:type="spellStart"/>
+      <w:r>
+        <w:t>center</w:t>
+      </w:r>
+      <w:proofErr w:type="spellEnd"/>
+      <w:r>
+        <w:t xml:space="preserve"> justify-</w:t>
+      </w:r>
+      <w:proofErr w:type="spellStart"/>
+      <w:r>
+        <w:t>center</w:t>
+      </w:r>
+      <w:proofErr w:type="spellEnd"/>
+      <w:r>
+        <w:t xml:space="preserve"> h-full text-gray-500"&gt;</w:t>
+      </w:r>
+    </w:p>
+    <w:p>
+      <w:r>
+        <w:t xml:space="preserve">          Select up to 4 hands to compare</w:t>
+      </w:r>
+    </w:p>
+    <w:p>
+      <w:r>
+        <w:t xml:space="preserve">        &lt;/div&gt;</w:t>
+      </w:r>
+    </w:p>
+    <w:p>
+      <w:r>
+        <w:t xml:space="preserve">      );</w:t>
+      </w:r>
+    </w:p>
+    <w:p>
+      <w:r>
+        <w:t xml:space="preserve">    }</w:t>
+      </w:r>
+    </w:p>
+    <w:p/>
+    <w:p>
+      <w:r>
+        <w:t xml:space="preserve">    return (</w:t>
+      </w:r>
+    </w:p>
+    <w:p>
+      <w:r>
+        <w:t xml:space="preserve">      &lt;div </w:t>
+      </w:r>
+      <w:proofErr w:type="spellStart"/>
+      <w:r>
+        <w:t>className</w:t>
+      </w:r>
+      <w:proofErr w:type="spellEnd"/>
+      <w:r>
+        <w:t>="grid grid-cols-2 gap-4 h-full"&gt;</w:t>
+      </w:r>
+    </w:p>
+    <w:p>
+      <w:r>
+        <w:t xml:space="preserve">        {</w:t>
+      </w:r>
+      <w:proofErr w:type="spellStart"/>
+      <w:proofErr w:type="gramStart"/>
+      <w:r>
+        <w:t>hands.map</w:t>
+      </w:r>
+      <w:proofErr w:type="spellEnd"/>
+      <w:r>
+        <w:t>(</w:t>
+      </w:r>
+      <w:proofErr w:type="gramEnd"/>
+      <w:r>
+        <w:t xml:space="preserve">(hand, </w:t>
+      </w:r>
+      <w:proofErr w:type="spellStart"/>
+      <w:r>
+        <w:t>idx</w:t>
+      </w:r>
+      <w:proofErr w:type="spellEnd"/>
+      <w:r>
+        <w:t>) =&gt; (</w:t>
+      </w:r>
+    </w:p>
+    <w:p>
+      <w:r>
+        <w:t xml:space="preserve">          &lt;div key={hand} </w:t>
+      </w:r>
+      <w:proofErr w:type="spellStart"/>
+      <w:r>
+        <w:t>className</w:t>
+      </w:r>
+      <w:proofErr w:type="spellEnd"/>
+      <w:r>
+        <w:t>="border rounded-</w:t>
+      </w:r>
+      <w:proofErr w:type="spellStart"/>
+      <w:r>
+        <w:t>lg</w:t>
+      </w:r>
+      <w:proofErr w:type="spellEnd"/>
+      <w:r>
+        <w:t xml:space="preserve"> p-4"&gt;</w:t>
+      </w:r>
+    </w:p>
+    <w:p>
+      <w:r>
+        <w:t xml:space="preserve">            &lt;h3 </w:t>
+      </w:r>
+      <w:proofErr w:type="spellStart"/>
+      <w:r>
+        <w:t>className</w:t>
+      </w:r>
+      <w:proofErr w:type="spellEnd"/>
+      <w:r>
+        <w:t>="text-</w:t>
+      </w:r>
+      <w:proofErr w:type="spellStart"/>
+      <w:r>
+        <w:t>lg</w:t>
+      </w:r>
+      <w:proofErr w:type="spellEnd"/>
+      <w:r>
+        <w:t xml:space="preserve"> font-bold text-</w:t>
+      </w:r>
+      <w:proofErr w:type="spellStart"/>
+      <w:r>
+        <w:t>center</w:t>
+      </w:r>
+      <w:proofErr w:type="spellEnd"/>
+      <w:r>
+        <w:t xml:space="preserve"> mb-2"&gt;{hand}&lt;/h3&gt;</w:t>
+      </w:r>
+    </w:p>
+    <w:p>
+      <w:r>
+        <w:t xml:space="preserve">            &lt;</w:t>
+      </w:r>
+      <w:proofErr w:type="spellStart"/>
+      <w:r>
+        <w:t>ResponsiveContainer</w:t>
+      </w:r>
+      <w:proofErr w:type="spellEnd"/>
+      <w:r>
+        <w:t xml:space="preserve"> width="100%" height</w:t>
+      </w:r>
+      <w:proofErr w:type="gramStart"/>
+      <w:r>
+        <w:t>={</w:t>
+      </w:r>
+      <w:proofErr w:type="gramEnd"/>
+      <w:r>
+        <w:t>200}&gt;</w:t>
+      </w:r>
+    </w:p>
+    <w:p>
+      <w:r>
+        <w:t xml:space="preserve">              &lt;</w:t>
+      </w:r>
+      <w:proofErr w:type="spellStart"/>
+      <w:r>
+        <w:t>BarChart</w:t>
+      </w:r>
+      <w:proofErr w:type="spellEnd"/>
+      <w:r>
+        <w:t xml:space="preserve"> data={</w:t>
+      </w:r>
+      <w:proofErr w:type="spellStart"/>
+      <w:r>
+        <w:t>chartData</w:t>
+      </w:r>
+      <w:proofErr w:type="spellEnd"/>
+      <w:r>
+        <w:t>}&gt;</w:t>
+      </w:r>
+    </w:p>
+    <w:p>
+      <w:r>
+        <w:t xml:space="preserve">                &lt;</w:t>
+      </w:r>
+      <w:proofErr w:type="spellStart"/>
+      <w:r>
+        <w:t>CartesianGrid</w:t>
+      </w:r>
+      <w:proofErr w:type="spellEnd"/>
+      <w:r>
+        <w:t xml:space="preserve"> </w:t>
+      </w:r>
+      <w:proofErr w:type="spellStart"/>
+      <w:r>
+        <w:t>strokeDasharray</w:t>
+      </w:r>
+      <w:proofErr w:type="spellEnd"/>
+      <w:r>
+        <w:t>="3 3" /&gt;</w:t>
+      </w:r>
+    </w:p>
+    <w:p>
+      <w:r>
+        <w:t xml:space="preserve">                &lt;</w:t>
+      </w:r>
+      <w:proofErr w:type="spellStart"/>
+      <w:r>
+        <w:t>XAxis</w:t>
+      </w:r>
+      <w:proofErr w:type="spellEnd"/>
+      <w:r>
+        <w:t xml:space="preserve"> </w:t>
+      </w:r>
+      <w:proofErr w:type="spellStart"/>
+      <w:r>
+        <w:t>dataKey</w:t>
+      </w:r>
+      <w:proofErr w:type="spellEnd"/>
+      <w:r>
+        <w:t>="bucket" /&gt;</w:t>
+      </w:r>
+    </w:p>
+    <w:p>
+      <w:r>
+        <w:t xml:space="preserve">                &lt;</w:t>
+      </w:r>
+      <w:proofErr w:type="spellStart"/>
+      <w:r>
+        <w:t>YAxis</w:t>
+      </w:r>
+      <w:proofErr w:type="spellEnd"/>
+      <w:r>
+        <w:t xml:space="preserve"> /&gt;</w:t>
+      </w:r>
+    </w:p>
+    <w:p>
+      <w:r>
+        <w:t xml:space="preserve">                &lt;Tooltip /&gt;</w:t>
+      </w:r>
+    </w:p>
+    <w:p>
+      <w:r>
+        <w:t xml:space="preserve">                &lt;Bar </w:t>
+      </w:r>
+      <w:proofErr w:type="spellStart"/>
+      <w:r>
+        <w:t>dataKey</w:t>
+      </w:r>
+      <w:proofErr w:type="spellEnd"/>
+      <w:r>
+        <w:t>={hand} fill</w:t>
+      </w:r>
+      <w:proofErr w:type="gramStart"/>
+      <w:r>
+        <w:t>={</w:t>
+      </w:r>
+      <w:proofErr w:type="spellStart"/>
+      <w:r>
+        <w:t>colors</w:t>
+      </w:r>
+      <w:proofErr w:type="spellEnd"/>
+      <w:r>
+        <w:t>[</w:t>
+      </w:r>
+      <w:proofErr w:type="spellStart"/>
+      <w:proofErr w:type="gramEnd"/>
+      <w:r>
+        <w:t>idx</w:t>
+      </w:r>
+      <w:proofErr w:type="spellEnd"/>
+      <w:r>
+        <w:t xml:space="preserve"> % </w:t>
+      </w:r>
+      <w:proofErr w:type="spellStart"/>
+      <w:proofErr w:type="gramStart"/>
+      <w:r>
+        <w:t>colors.length</w:t>
+      </w:r>
+      <w:proofErr w:type="spellEnd"/>
+      <w:proofErr w:type="gramEnd"/>
+      <w:r>
+        <w:t>]} /&gt;</w:t>
+      </w:r>
+    </w:p>
+    <w:p>
+      <w:r>
+        <w:t xml:space="preserve">              &lt;/</w:t>
+      </w:r>
+      <w:proofErr w:type="spellStart"/>
+      <w:r>
+        <w:t>BarChart</w:t>
+      </w:r>
+      <w:proofErr w:type="spellEnd"/>
+      <w:r>
+        <w:t>&gt;</w:t>
+      </w:r>
+    </w:p>
+    <w:p>
+      <w:r>
+        <w:t xml:space="preserve">            &lt;/</w:t>
+      </w:r>
+      <w:proofErr w:type="spellStart"/>
+      <w:r>
+        <w:t>ResponsiveContainer</w:t>
+      </w:r>
+      <w:proofErr w:type="spellEnd"/>
+      <w:r>
+        <w:t>&gt;</w:t>
+      </w:r>
+    </w:p>
+    <w:p>
+      <w:r>
+        <w:t xml:space="preserve">          &lt;/div&gt;</w:t>
+      </w:r>
+    </w:p>
+    <w:p>
+      <w:r>
+        <w:t xml:space="preserve">        ))}</w:t>
+      </w:r>
+    </w:p>
+    <w:p>
+      <w:r>
+        <w:t xml:space="preserve">        {/* Fill empty slots */}</w:t>
+      </w:r>
+    </w:p>
+    <w:p>
+      <w:r>
+        <w:t xml:space="preserve">        {</w:t>
+      </w:r>
+      <w:proofErr w:type="spellStart"/>
+      <w:r>
+        <w:t>Array.from</w:t>
+      </w:r>
+      <w:proofErr w:type="spellEnd"/>
+      <w:r>
+        <w:t xml:space="preserve">({length: 4 - </w:t>
+      </w:r>
+      <w:proofErr w:type="spellStart"/>
+      <w:proofErr w:type="gramStart"/>
+      <w:r>
+        <w:t>hands.length</w:t>
+      </w:r>
+      <w:proofErr w:type="spellEnd"/>
+      <w:proofErr w:type="gramEnd"/>
+      <w:r>
+        <w:t>}</w:t>
+      </w:r>
+      <w:proofErr w:type="gramStart"/>
+      <w:r>
+        <w:t>).map</w:t>
+      </w:r>
+      <w:proofErr w:type="gramEnd"/>
+      <w:r>
+        <w:t xml:space="preserve">((_, </w:t>
+      </w:r>
+      <w:proofErr w:type="spellStart"/>
+      <w:r>
+        <w:t>idx</w:t>
+      </w:r>
+      <w:proofErr w:type="spellEnd"/>
+      <w:r>
+        <w:t>) =&gt; (</w:t>
+      </w:r>
+    </w:p>
+    <w:p>
+      <w:r>
+        <w:t xml:space="preserve">          &lt;div key={`empty-${</w:t>
+      </w:r>
+      <w:proofErr w:type="spellStart"/>
+      <w:r>
+        <w:t>idx</w:t>
+      </w:r>
+      <w:proofErr w:type="spellEnd"/>
+      <w:r>
+        <w:t xml:space="preserve">}`} </w:t>
+      </w:r>
+      <w:proofErr w:type="spellStart"/>
+      <w:r>
+        <w:t>className</w:t>
+      </w:r>
+      <w:proofErr w:type="spellEnd"/>
+      <w:r>
+        <w:t>="border border-dashed border-gray-300 rounded-</w:t>
+      </w:r>
+      <w:proofErr w:type="spellStart"/>
+      <w:r>
+        <w:t>lg</w:t>
+      </w:r>
+      <w:proofErr w:type="spellEnd"/>
+      <w:r>
+        <w:t xml:space="preserve"> flex items-</w:t>
+      </w:r>
+      <w:proofErr w:type="spellStart"/>
+      <w:r>
+        <w:t>center</w:t>
+      </w:r>
+      <w:proofErr w:type="spellEnd"/>
+      <w:r>
+        <w:t xml:space="preserve"> justify-</w:t>
+      </w:r>
+      <w:proofErr w:type="spellStart"/>
+      <w:r>
+        <w:t>center</w:t>
+      </w:r>
+      <w:proofErr w:type="spellEnd"/>
+      <w:r>
+        <w:t xml:space="preserve"> text-gray-400"&gt;</w:t>
+      </w:r>
+    </w:p>
+    <w:p>
+      <w:r>
+        <w:t xml:space="preserve">            Empty Slot</w:t>
+      </w:r>
+    </w:p>
+    <w:p>
+      <w:r>
+        <w:t xml:space="preserve">          &lt;/div&gt;</w:t>
+      </w:r>
+    </w:p>
+    <w:p>
+      <w:r>
+        <w:t xml:space="preserve">        ))}</w:t>
+      </w:r>
+    </w:p>
+    <w:p>
+      <w:r>
+        <w:t xml:space="preserve">      &lt;/div&gt;</w:t>
+      </w:r>
+    </w:p>
+    <w:p>
+      <w:r>
+        <w:t xml:space="preserve">    );</w:t>
+      </w:r>
+    </w:p>
+    <w:p>
+      <w:r>
+        <w:lastRenderedPageBreak/>
+        <w:t xml:space="preserve">  };</w:t>
+      </w:r>
+    </w:p>
+    <w:p/>
+    <w:p>
+      <w:r>
+        <w:t xml:space="preserve">  </w:t>
+      </w:r>
+      <w:proofErr w:type="spellStart"/>
+      <w:r>
+        <w:t>const</w:t>
+      </w:r>
+      <w:proofErr w:type="spellEnd"/>
+      <w:r>
+        <w:t xml:space="preserve"> </w:t>
+      </w:r>
+      <w:proofErr w:type="spellStart"/>
+      <w:r>
+        <w:t>renderRangeMode</w:t>
+      </w:r>
+      <w:proofErr w:type="spellEnd"/>
+      <w:r>
+        <w:t xml:space="preserve"> = () =&gt; {</w:t>
+      </w:r>
+    </w:p>
+    <w:p>
+      <w:r>
+        <w:t xml:space="preserve">    if (</w:t>
+      </w:r>
+      <w:proofErr w:type="spellStart"/>
+      <w:r>
+        <w:t>selectedHands.length</w:t>
+      </w:r>
+      <w:proofErr w:type="spellEnd"/>
+      <w:r>
+        <w:t xml:space="preserve"> === 0) {</w:t>
+      </w:r>
+    </w:p>
+    <w:p>
+      <w:r>
+        <w:t xml:space="preserve">      return (</w:t>
+      </w:r>
+    </w:p>
+    <w:p>
+      <w:r>
+        <w:t xml:space="preserve">        &lt;div </w:t>
+      </w:r>
+      <w:proofErr w:type="spellStart"/>
+      <w:r>
+        <w:t>className</w:t>
+      </w:r>
+      <w:proofErr w:type="spellEnd"/>
+      <w:r>
+        <w:t>="flex items-</w:t>
+      </w:r>
+      <w:proofErr w:type="spellStart"/>
+      <w:r>
+        <w:t>center</w:t>
+      </w:r>
+      <w:proofErr w:type="spellEnd"/>
+      <w:r>
+        <w:t xml:space="preserve"> justify-</w:t>
+      </w:r>
+      <w:proofErr w:type="spellStart"/>
+      <w:r>
+        <w:t>center</w:t>
+      </w:r>
+      <w:proofErr w:type="spellEnd"/>
+      <w:r>
+        <w:t xml:space="preserve"> h-full text-gray-500"&gt;</w:t>
+      </w:r>
+    </w:p>
+    <w:p>
+      <w:r>
+        <w:t xml:space="preserve">          Select hands to view range distribution</w:t>
+      </w:r>
+    </w:p>
+    <w:p>
+      <w:r>
+        <w:t xml:space="preserve">        &lt;/div&gt;</w:t>
+      </w:r>
+    </w:p>
+    <w:p>
+      <w:r>
+        <w:t xml:space="preserve">      );</w:t>
+      </w:r>
+    </w:p>
+    <w:p>
+      <w:r>
+        <w:t xml:space="preserve">    }</w:t>
+      </w:r>
+    </w:p>
+    <w:p/>
+    <w:p>
+      <w:r>
+        <w:t xml:space="preserve">    // Calculate composite distribution (average of selected hands)</w:t>
+      </w:r>
+    </w:p>
+    <w:p>
+      <w:r>
+        <w:t xml:space="preserve">    </w:t>
+      </w:r>
+      <w:proofErr w:type="spellStart"/>
+      <w:r>
+        <w:t>const</w:t>
+      </w:r>
+      <w:proofErr w:type="spellEnd"/>
+      <w:r>
+        <w:t xml:space="preserve"> </w:t>
+      </w:r>
+      <w:proofErr w:type="spellStart"/>
+      <w:r>
+        <w:t>compositeData</w:t>
+      </w:r>
+      <w:proofErr w:type="spellEnd"/>
+      <w:r>
+        <w:t xml:space="preserve"> = </w:t>
+      </w:r>
+      <w:proofErr w:type="spellStart"/>
+      <w:r>
+        <w:t>Array.from</w:t>
+      </w:r>
+      <w:proofErr w:type="spellEnd"/>
+      <w:r>
+        <w:t xml:space="preserve">({length: 100}, (_, </w:t>
+      </w:r>
+      <w:proofErr w:type="spellStart"/>
+      <w:r>
+        <w:t>i</w:t>
+      </w:r>
+      <w:proofErr w:type="spellEnd"/>
+      <w:r>
+        <w:t>) =&gt; {</w:t>
+      </w:r>
+    </w:p>
+    <w:p>
+      <w:r>
+        <w:t xml:space="preserve">      let sum = 0;</w:t>
+      </w:r>
+    </w:p>
+    <w:p>
+      <w:r>
+        <w:t xml:space="preserve">      let count = 0;</w:t>
+      </w:r>
+    </w:p>
+    <w:p>
+      <w:r>
+        <w:t xml:space="preserve">      </w:t>
+      </w:r>
+      <w:proofErr w:type="spellStart"/>
+      <w:r>
+        <w:t>selectedHands.forEach</w:t>
+      </w:r>
+      <w:proofErr w:type="spellEnd"/>
+      <w:r>
+        <w:t>(hand =&gt; {</w:t>
+      </w:r>
+    </w:p>
+    <w:p>
+      <w:r>
+        <w:t xml:space="preserve">        if (</w:t>
+      </w:r>
+      <w:proofErr w:type="spellStart"/>
+      <w:r>
+        <w:t>mockHandData</w:t>
+      </w:r>
+      <w:proofErr w:type="spellEnd"/>
+      <w:r>
+        <w:t xml:space="preserve">[hand] &amp;&amp; </w:t>
+      </w:r>
+      <w:proofErr w:type="spellStart"/>
+      <w:r>
+        <w:t>mockHandData</w:t>
+      </w:r>
+      <w:proofErr w:type="spellEnd"/>
+      <w:r>
+        <w:t>[hand][</w:t>
+      </w:r>
+      <w:proofErr w:type="spellStart"/>
+      <w:r>
+        <w:t>i</w:t>
+      </w:r>
+      <w:proofErr w:type="spellEnd"/>
+      <w:proofErr w:type="gramStart"/>
+      <w:r>
+        <w:t>] !</w:t>
+      </w:r>
+      <w:proofErr w:type="gramEnd"/>
+      <w:r>
+        <w:t>== undefined) {</w:t>
+      </w:r>
+    </w:p>
+    <w:p>
+      <w:r>
+        <w:t xml:space="preserve">          sum += </w:t>
+      </w:r>
+      <w:proofErr w:type="spellStart"/>
+      <w:r>
+        <w:t>mockHandData</w:t>
+      </w:r>
+      <w:proofErr w:type="spellEnd"/>
+      <w:r>
+        <w:t>[hand][</w:t>
+      </w:r>
+      <w:proofErr w:type="spellStart"/>
+      <w:r>
+        <w:t>i</w:t>
+      </w:r>
+      <w:proofErr w:type="spellEnd"/>
+      <w:r>
+        <w:t>];</w:t>
+      </w:r>
+    </w:p>
+    <w:p>
+      <w:r>
+        <w:t xml:space="preserve">          count++;</w:t>
+      </w:r>
+    </w:p>
+    <w:p>
+      <w:r>
+        <w:t xml:space="preserve">        }</w:t>
+      </w:r>
+    </w:p>
+    <w:p>
+      <w:r>
+        <w:t xml:space="preserve">      });</w:t>
+      </w:r>
+    </w:p>
+    <w:p>
+      <w:r>
+        <w:t xml:space="preserve">      return {</w:t>
+      </w:r>
+    </w:p>
+    <w:p>
+      <w:r>
+        <w:t xml:space="preserve">        bucket: </w:t>
+      </w:r>
+      <w:proofErr w:type="spellStart"/>
+      <w:r>
+        <w:t>i</w:t>
+      </w:r>
+      <w:proofErr w:type="spellEnd"/>
+      <w:r>
+        <w:t xml:space="preserve"> + 1,</w:t>
+      </w:r>
+    </w:p>
+    <w:p>
+      <w:r>
+        <w:t xml:space="preserve">        composite: count &gt; </w:t>
+      </w:r>
+      <w:proofErr w:type="gramStart"/>
+      <w:r>
+        <w:t>0 ?</w:t>
+      </w:r>
+      <w:proofErr w:type="gramEnd"/>
+      <w:r>
+        <w:t xml:space="preserve"> sum / </w:t>
+      </w:r>
+      <w:proofErr w:type="gramStart"/>
+      <w:r>
+        <w:t>count :</w:t>
+      </w:r>
+      <w:proofErr w:type="gramEnd"/>
+      <w:r>
+        <w:t xml:space="preserve"> 0</w:t>
+      </w:r>
+    </w:p>
+    <w:p>
+      <w:r>
+        <w:t xml:space="preserve">      };</w:t>
+      </w:r>
+    </w:p>
+    <w:p>
+      <w:r>
+        <w:t xml:space="preserve">    });</w:t>
+      </w:r>
+    </w:p>
+    <w:p/>
+    <w:p>
+      <w:r>
+        <w:t xml:space="preserve">    return (</w:t>
+      </w:r>
+    </w:p>
+    <w:p>
+      <w:r>
+        <w:t xml:space="preserve">      &lt;div </w:t>
+      </w:r>
+      <w:proofErr w:type="spellStart"/>
+      <w:r>
+        <w:t>className</w:t>
+      </w:r>
+      <w:proofErr w:type="spellEnd"/>
+      <w:r>
+        <w:t>="h-full"&gt;</w:t>
+      </w:r>
+    </w:p>
+    <w:p>
+      <w:r>
+        <w:t xml:space="preserve">        &lt;h3 </w:t>
+      </w:r>
+      <w:proofErr w:type="spellStart"/>
+      <w:r>
+        <w:t>className</w:t>
+      </w:r>
+      <w:proofErr w:type="spellEnd"/>
+      <w:r>
+        <w:t>="text-xl font-bold text-</w:t>
+      </w:r>
+      <w:proofErr w:type="spellStart"/>
+      <w:r>
+        <w:t>center</w:t>
+      </w:r>
+      <w:proofErr w:type="spellEnd"/>
+      <w:r>
+        <w:t xml:space="preserve"> mb-4"&gt;</w:t>
+      </w:r>
+    </w:p>
+    <w:p>
+      <w:r>
+        <w:t xml:space="preserve">          Range Distribution ({</w:t>
+      </w:r>
+      <w:proofErr w:type="spellStart"/>
+      <w:r>
+        <w:t>selectedHands.length</w:t>
+      </w:r>
+      <w:proofErr w:type="spellEnd"/>
+      <w:r>
+        <w:t>} hands selected)</w:t>
+      </w:r>
+    </w:p>
+    <w:p>
+      <w:r>
+        <w:lastRenderedPageBreak/>
+        <w:t xml:space="preserve">        &lt;/h3&gt;</w:t>
+      </w:r>
+    </w:p>
+    <w:p>
+      <w:r>
+        <w:t xml:space="preserve">        &lt;div </w:t>
+      </w:r>
+      <w:proofErr w:type="spellStart"/>
+      <w:r>
+        <w:t>className</w:t>
+      </w:r>
+      <w:proofErr w:type="spellEnd"/>
+      <w:r>
+        <w:t>="text-</w:t>
+      </w:r>
+      <w:proofErr w:type="spellStart"/>
+      <w:r>
+        <w:t>center</w:t>
+      </w:r>
+      <w:proofErr w:type="spellEnd"/>
+      <w:r>
+        <w:t xml:space="preserve"> mb-4 text-</w:t>
+      </w:r>
+      <w:proofErr w:type="spellStart"/>
+      <w:r>
+        <w:t>sm</w:t>
+      </w:r>
+      <w:proofErr w:type="spellEnd"/>
+      <w:r>
+        <w:t xml:space="preserve"> text-gray-600"&gt;</w:t>
+      </w:r>
+    </w:p>
+    <w:p>
+      <w:r>
+        <w:t xml:space="preserve">          Selected: {</w:t>
+      </w:r>
+      <w:proofErr w:type="spellStart"/>
+      <w:r>
+        <w:t>selectedHands.join</w:t>
+      </w:r>
+      <w:proofErr w:type="spellEnd"/>
+      <w:r>
+        <w:t>(', ')}</w:t>
+      </w:r>
+    </w:p>
+    <w:p>
+      <w:r>
+        <w:t xml:space="preserve">        &lt;/div&gt;</w:t>
+      </w:r>
+    </w:p>
+    <w:p>
+      <w:r>
+        <w:t xml:space="preserve">        &lt;</w:t>
+      </w:r>
+      <w:proofErr w:type="spellStart"/>
+      <w:r>
+        <w:t>ResponsiveContainer</w:t>
+      </w:r>
+      <w:proofErr w:type="spellEnd"/>
+      <w:r>
+        <w:t xml:space="preserve"> width="100%" height="85%"&gt;</w:t>
+      </w:r>
+    </w:p>
+    <w:p>
+      <w:r>
+        <w:t xml:space="preserve">          &lt;</w:t>
+      </w:r>
+      <w:proofErr w:type="spellStart"/>
+      <w:r>
+        <w:t>BarChart</w:t>
+      </w:r>
+      <w:proofErr w:type="spellEnd"/>
+      <w:r>
+        <w:t xml:space="preserve"> data={</w:t>
+      </w:r>
+      <w:proofErr w:type="spellStart"/>
+      <w:r>
+        <w:t>compositeData</w:t>
+      </w:r>
+      <w:proofErr w:type="spellEnd"/>
+      <w:r>
+        <w:t>}&gt;</w:t>
+      </w:r>
+    </w:p>
+    <w:p>
+      <w:r>
+        <w:t xml:space="preserve">            &lt;</w:t>
+      </w:r>
+      <w:proofErr w:type="spellStart"/>
+      <w:r>
+        <w:t>CartesianGrid</w:t>
+      </w:r>
+      <w:proofErr w:type="spellEnd"/>
+      <w:r>
+        <w:t xml:space="preserve"> </w:t>
+      </w:r>
+      <w:proofErr w:type="spellStart"/>
+      <w:r>
+        <w:t>strokeDasharray</w:t>
+      </w:r>
+      <w:proofErr w:type="spellEnd"/>
+      <w:r>
+        <w:t>="3 3" /&gt;</w:t>
+      </w:r>
+    </w:p>
+    <w:p>
+      <w:r>
+        <w:t xml:space="preserve">            &lt;</w:t>
+      </w:r>
+      <w:proofErr w:type="spellStart"/>
+      <w:r>
+        <w:t>XAxis</w:t>
+      </w:r>
+      <w:proofErr w:type="spellEnd"/>
+      <w:r>
+        <w:t xml:space="preserve"> </w:t>
+      </w:r>
+      <w:proofErr w:type="spellStart"/>
+      <w:r>
+        <w:t>dataKey</w:t>
+      </w:r>
+      <w:proofErr w:type="spellEnd"/>
+      <w:r>
+        <w:t>="bucket" /&gt;</w:t>
+      </w:r>
+    </w:p>
+    <w:p>
+      <w:r>
+        <w:t xml:space="preserve">            &lt;</w:t>
+      </w:r>
+      <w:proofErr w:type="spellStart"/>
+      <w:r>
+        <w:t>YAxis</w:t>
+      </w:r>
+      <w:proofErr w:type="spellEnd"/>
+      <w:r>
+        <w:t xml:space="preserve"> /&gt;</w:t>
+      </w:r>
+    </w:p>
+    <w:p>
+      <w:r>
+        <w:t xml:space="preserve">            &lt;Tooltip /&gt;</w:t>
+      </w:r>
+    </w:p>
+    <w:p>
+      <w:r>
+        <w:t xml:space="preserve">            &lt;Bar </w:t>
+      </w:r>
+      <w:proofErr w:type="spellStart"/>
+      <w:r>
+        <w:t>dataKey</w:t>
+      </w:r>
+      <w:proofErr w:type="spellEnd"/>
+      <w:r>
+        <w:t>="composite" fill="#8884d8" /&gt;</w:t>
+      </w:r>
+    </w:p>
+    <w:p>
+      <w:r>
+        <w:t xml:space="preserve">          &lt;/</w:t>
+      </w:r>
+      <w:proofErr w:type="spellStart"/>
+      <w:r>
+        <w:t>BarChart</w:t>
+      </w:r>
+      <w:proofErr w:type="spellEnd"/>
+      <w:r>
+        <w:t>&gt;</w:t>
+      </w:r>
+    </w:p>
+    <w:p>
+      <w:r>
+        <w:t xml:space="preserve">        &lt;/</w:t>
+      </w:r>
+      <w:proofErr w:type="spellStart"/>
+      <w:r>
+        <w:t>ResponsiveContainer</w:t>
+      </w:r>
+      <w:proofErr w:type="spellEnd"/>
+      <w:r>
+        <w:t>&gt;</w:t>
+      </w:r>
+    </w:p>
+    <w:p>
+      <w:r>
+        <w:t xml:space="preserve">      &lt;/div&gt;</w:t>
+      </w:r>
+    </w:p>
+    <w:p>
+      <w:r>
+        <w:t xml:space="preserve">    );</w:t>
+      </w:r>
+    </w:p>
+    <w:p>
+      <w:r>
+        <w:t xml:space="preserve">  };</w:t>
+      </w:r>
+    </w:p>
+    <w:p/>
+    <w:p>
+      <w:r>
+        <w:t xml:space="preserve">  </w:t>
+      </w:r>
+      <w:proofErr w:type="spellStart"/>
+      <w:r>
+        <w:t>const</w:t>
+      </w:r>
+      <w:proofErr w:type="spellEnd"/>
+      <w:r>
+        <w:t xml:space="preserve"> </w:t>
+      </w:r>
+      <w:proofErr w:type="spellStart"/>
+      <w:r>
+        <w:t>renderCumulativeMode</w:t>
+      </w:r>
+      <w:proofErr w:type="spellEnd"/>
+      <w:r>
+        <w:t xml:space="preserve"> = () =&gt; {</w:t>
+      </w:r>
+    </w:p>
+    <w:p>
+      <w:r>
+        <w:t xml:space="preserve">    if (</w:t>
+      </w:r>
+      <w:proofErr w:type="spellStart"/>
+      <w:r>
+        <w:t>selectedHands.length</w:t>
+      </w:r>
+      <w:proofErr w:type="spellEnd"/>
+      <w:r>
+        <w:t xml:space="preserve"> === 0) {</w:t>
+      </w:r>
+    </w:p>
+    <w:p>
+      <w:r>
+        <w:t xml:space="preserve">      return (</w:t>
+      </w:r>
+    </w:p>
+    <w:p>
+      <w:r>
+        <w:t xml:space="preserve">        &lt;div </w:t>
+      </w:r>
+      <w:proofErr w:type="spellStart"/>
+      <w:r>
+        <w:t>className</w:t>
+      </w:r>
+      <w:proofErr w:type="spellEnd"/>
+      <w:r>
+        <w:t>="flex items-</w:t>
+      </w:r>
+      <w:proofErr w:type="spellStart"/>
+      <w:r>
+        <w:t>center</w:t>
+      </w:r>
+      <w:proofErr w:type="spellEnd"/>
+      <w:r>
+        <w:t xml:space="preserve"> justify-</w:t>
+      </w:r>
+      <w:proofErr w:type="spellStart"/>
+      <w:r>
+        <w:t>center</w:t>
+      </w:r>
+      <w:proofErr w:type="spellEnd"/>
+      <w:r>
+        <w:t xml:space="preserve"> h-full text-gray-500"&gt;</w:t>
+      </w:r>
+    </w:p>
+    <w:p>
+      <w:r>
+        <w:t xml:space="preserve">          Select hands to view cumulative frequency</w:t>
+      </w:r>
+    </w:p>
+    <w:p>
+      <w:r>
+        <w:t xml:space="preserve">        &lt;/div&gt;</w:t>
+      </w:r>
+    </w:p>
+    <w:p>
+      <w:r>
+        <w:t xml:space="preserve">      );</w:t>
+      </w:r>
+    </w:p>
+    <w:p>
+      <w:r>
+        <w:t xml:space="preserve">    }</w:t>
+      </w:r>
+    </w:p>
+    <w:p/>
+    <w:p>
+      <w:r>
+        <w:t xml:space="preserve">    return (</w:t>
+      </w:r>
+    </w:p>
+    <w:p>
+      <w:r>
+        <w:t xml:space="preserve">      &lt;div </w:t>
+      </w:r>
+      <w:proofErr w:type="spellStart"/>
+      <w:r>
+        <w:t>className</w:t>
+      </w:r>
+      <w:proofErr w:type="spellEnd"/>
+      <w:r>
+        <w:t>="h-full"&gt;</w:t>
+      </w:r>
+    </w:p>
+    <w:p>
+      <w:r>
+        <w:t xml:space="preserve">        &lt;h3 </w:t>
+      </w:r>
+      <w:proofErr w:type="spellStart"/>
+      <w:r>
+        <w:t>className</w:t>
+      </w:r>
+      <w:proofErr w:type="spellEnd"/>
+      <w:r>
+        <w:t>="text-xl font-bold text-</w:t>
+      </w:r>
+      <w:proofErr w:type="spellStart"/>
+      <w:r>
+        <w:t>center</w:t>
+      </w:r>
+      <w:proofErr w:type="spellEnd"/>
+      <w:r>
+        <w:t xml:space="preserve"> mb-4"&gt;</w:t>
+      </w:r>
+    </w:p>
+    <w:p>
+      <w:r>
+        <w:t xml:space="preserve">          Cumulative Frequency Distribution</w:t>
+      </w:r>
+    </w:p>
+    <w:p>
+      <w:r>
+        <w:t xml:space="preserve">        &lt;/h3&gt;</w:t>
+      </w:r>
+    </w:p>
+    <w:p>
+      <w:r>
+        <w:lastRenderedPageBreak/>
+        <w:t xml:space="preserve">        &lt;div </w:t>
+      </w:r>
+      <w:proofErr w:type="spellStart"/>
+      <w:r>
+        <w:t>className</w:t>
+      </w:r>
+      <w:proofErr w:type="spellEnd"/>
+      <w:r>
+        <w:t>="text-</w:t>
+      </w:r>
+      <w:proofErr w:type="spellStart"/>
+      <w:r>
+        <w:t>center</w:t>
+      </w:r>
+      <w:proofErr w:type="spellEnd"/>
+      <w:r>
+        <w:t xml:space="preserve"> mb-4 text-</w:t>
+      </w:r>
+      <w:proofErr w:type="spellStart"/>
+      <w:r>
+        <w:t>sm</w:t>
+      </w:r>
+      <w:proofErr w:type="spellEnd"/>
+      <w:r>
+        <w:t xml:space="preserve"> text-gray-600"&gt;</w:t>
+      </w:r>
+    </w:p>
+    <w:p>
+      <w:r>
+        <w:t xml:space="preserve">          Selected: {</w:t>
+      </w:r>
+      <w:proofErr w:type="spellStart"/>
+      <w:r>
+        <w:t>selectedHands.join</w:t>
+      </w:r>
+      <w:proofErr w:type="spellEnd"/>
+      <w:r>
+        <w:t>(', ')}</w:t>
+      </w:r>
+    </w:p>
+    <w:p>
+      <w:r>
+        <w:t xml:space="preserve">        &lt;/div&gt;</w:t>
+      </w:r>
+    </w:p>
+    <w:p>
+      <w:r>
+        <w:t xml:space="preserve">        &lt;</w:t>
+      </w:r>
+      <w:proofErr w:type="spellStart"/>
+      <w:r>
+        <w:t>ResponsiveContainer</w:t>
+      </w:r>
+      <w:proofErr w:type="spellEnd"/>
+      <w:r>
+        <w:t xml:space="preserve"> width="100%" height="85%"&gt;</w:t>
+      </w:r>
+    </w:p>
+    <w:p>
+      <w:r>
+        <w:t xml:space="preserve">          &lt;</w:t>
+      </w:r>
+      <w:proofErr w:type="spellStart"/>
+      <w:r>
+        <w:t>LineChart</w:t>
+      </w:r>
+      <w:proofErr w:type="spellEnd"/>
+      <w:r>
+        <w:t xml:space="preserve"> data={</w:t>
+      </w:r>
+      <w:proofErr w:type="spellStart"/>
+      <w:r>
+        <w:t>cumulativeData</w:t>
+      </w:r>
+      <w:proofErr w:type="spellEnd"/>
+      <w:r>
+        <w:t>}&gt;</w:t>
+      </w:r>
+    </w:p>
+    <w:p>
+      <w:r>
+        <w:t xml:space="preserve">            &lt;</w:t>
+      </w:r>
+      <w:proofErr w:type="spellStart"/>
+      <w:r>
+        <w:t>CartesianGrid</w:t>
+      </w:r>
+      <w:proofErr w:type="spellEnd"/>
+      <w:r>
+        <w:t xml:space="preserve"> </w:t>
+      </w:r>
+      <w:proofErr w:type="spellStart"/>
+      <w:r>
+        <w:t>strokeDasharray</w:t>
+      </w:r>
+      <w:proofErr w:type="spellEnd"/>
+      <w:r>
+        <w:t>="3 3" /&gt;</w:t>
+      </w:r>
+    </w:p>
+    <w:p>
+      <w:r>
+        <w:t xml:space="preserve">            &lt;</w:t>
+      </w:r>
+      <w:proofErr w:type="spellStart"/>
+      <w:r>
+        <w:t>XAxis</w:t>
+      </w:r>
+      <w:proofErr w:type="spellEnd"/>
+      <w:r>
+        <w:t xml:space="preserve"> </w:t>
+      </w:r>
+      <w:proofErr w:type="spellStart"/>
+      <w:r>
+        <w:t>dataKey</w:t>
+      </w:r>
+      <w:proofErr w:type="spellEnd"/>
+      <w:r>
+        <w:t>="bucket" /&gt;</w:t>
+      </w:r>
+    </w:p>
+    <w:p>
+      <w:r>
+        <w:t xml:space="preserve">            &lt;</w:t>
+      </w:r>
+      <w:proofErr w:type="spellStart"/>
+      <w:r>
+        <w:t>YAxis</w:t>
+      </w:r>
+      <w:proofErr w:type="spellEnd"/>
+      <w:r>
+        <w:t xml:space="preserve"> /&gt;</w:t>
+      </w:r>
+    </w:p>
+    <w:p>
+      <w:r>
+        <w:t xml:space="preserve">            &lt;Tooltip /&gt;</w:t>
+      </w:r>
+    </w:p>
+    <w:p>
+      <w:r>
+        <w:t xml:space="preserve">            &lt;Legend /&gt;</w:t>
+      </w:r>
+    </w:p>
+    <w:p>
+      <w:r>
+        <w:t xml:space="preserve">            {</w:t>
+      </w:r>
+      <w:proofErr w:type="spellStart"/>
+      <w:proofErr w:type="gramStart"/>
+      <w:r>
+        <w:t>selectedHands.map</w:t>
+      </w:r>
+      <w:proofErr w:type="spellEnd"/>
+      <w:r>
+        <w:t>(</w:t>
+      </w:r>
+      <w:proofErr w:type="gramEnd"/>
+      <w:r>
+        <w:t xml:space="preserve">(hand, </w:t>
+      </w:r>
+      <w:proofErr w:type="spellStart"/>
+      <w:r>
+        <w:t>idx</w:t>
+      </w:r>
+      <w:proofErr w:type="spellEnd"/>
+      <w:r>
+        <w:t>) =&gt; (</w:t>
+      </w:r>
+    </w:p>
+    <w:p>
+      <w:r>
+        <w:t xml:space="preserve">              &lt;Line </w:t>
+      </w:r>
+    </w:p>
+    <w:p>
+      <w:r>
+        <w:t xml:space="preserve">                key={hand}</w:t>
+      </w:r>
+    </w:p>
+    <w:p>
+      <w:r>
+        <w:t xml:space="preserve">                type="monotone" </w:t>
+      </w:r>
+    </w:p>
+    <w:p>
+      <w:r>
+        <w:t xml:space="preserve">                </w:t>
+      </w:r>
+      <w:proofErr w:type="spellStart"/>
+      <w:r>
+        <w:t>dataKey</w:t>
+      </w:r>
+      <w:proofErr w:type="spellEnd"/>
+      <w:r>
+        <w:t xml:space="preserve">={hand} </w:t>
+      </w:r>
+    </w:p>
+    <w:p>
+      <w:r>
+        <w:t xml:space="preserve">                stroke</w:t>
+      </w:r>
+      <w:proofErr w:type="gramStart"/>
+      <w:r>
+        <w:t>={</w:t>
+      </w:r>
+      <w:proofErr w:type="spellStart"/>
+      <w:r>
+        <w:t>colors</w:t>
+      </w:r>
+      <w:proofErr w:type="spellEnd"/>
+      <w:r>
+        <w:t>[</w:t>
+      </w:r>
+      <w:proofErr w:type="spellStart"/>
+      <w:proofErr w:type="gramEnd"/>
+      <w:r>
+        <w:t>idx</w:t>
+      </w:r>
+      <w:proofErr w:type="spellEnd"/>
+      <w:r>
+        <w:t xml:space="preserve"> % </w:t>
+      </w:r>
+      <w:proofErr w:type="spellStart"/>
+      <w:proofErr w:type="gramStart"/>
+      <w:r>
+        <w:t>colors.length</w:t>
+      </w:r>
+      <w:proofErr w:type="spellEnd"/>
+      <w:proofErr w:type="gramEnd"/>
+      <w:r>
+        <w:t>]}</w:t>
+      </w:r>
+    </w:p>
+    <w:p>
+      <w:r>
+        <w:t xml:space="preserve">                </w:t>
+      </w:r>
+      <w:proofErr w:type="spellStart"/>
+      <w:r>
+        <w:t>strokeWidth</w:t>
+      </w:r>
+      <w:proofErr w:type="spellEnd"/>
+      <w:proofErr w:type="gramStart"/>
+      <w:r>
+        <w:t>={</w:t>
+      </w:r>
+      <w:proofErr w:type="gramEnd"/>
+      <w:r>
+        <w:t>2}</w:t>
+      </w:r>
+    </w:p>
+    <w:p>
+      <w:r>
+        <w:t xml:space="preserve">                dot={false}</w:t>
+      </w:r>
+    </w:p>
+    <w:p>
+      <w:r>
+        <w:t xml:space="preserve">              /&gt;</w:t>
+      </w:r>
+    </w:p>
+    <w:p>
+      <w:r>
+        <w:t xml:space="preserve">            ))}</w:t>
+      </w:r>
+    </w:p>
+    <w:p>
+      <w:r>
+        <w:t xml:space="preserve">          &lt;/</w:t>
+      </w:r>
+      <w:proofErr w:type="spellStart"/>
+      <w:r>
+        <w:t>LineChart</w:t>
+      </w:r>
+      <w:proofErr w:type="spellEnd"/>
+      <w:r>
+        <w:t>&gt;</w:t>
+      </w:r>
+    </w:p>
+    <w:p>
+      <w:r>
+        <w:t xml:space="preserve">        &lt;/</w:t>
+      </w:r>
+      <w:proofErr w:type="spellStart"/>
+      <w:r>
+        <w:t>ResponsiveContainer</w:t>
+      </w:r>
+      <w:proofErr w:type="spellEnd"/>
+      <w:r>
+        <w:t>&gt;</w:t>
+      </w:r>
+    </w:p>
+    <w:p>
+      <w:r>
+        <w:t xml:space="preserve">      &lt;/div&gt;</w:t>
+      </w:r>
+    </w:p>
+    <w:p>
+      <w:r>
+        <w:t xml:space="preserve">    );</w:t>
+      </w:r>
+    </w:p>
+    <w:p>
+      <w:r>
+        <w:t xml:space="preserve">  };</w:t>
+      </w:r>
+    </w:p>
+    <w:p/>
+    <w:p>
+      <w:r>
+        <w:t xml:space="preserve">  return (</w:t>
+      </w:r>
+    </w:p>
+    <w:p>
+      <w:r>
+        <w:t xml:space="preserve">    &lt;div </w:t>
+      </w:r>
+      <w:proofErr w:type="spellStart"/>
+      <w:r>
+        <w:t>className</w:t>
+      </w:r>
+      <w:proofErr w:type="spellEnd"/>
+      <w:r>
+        <w:t>="flex h-screen bg-gray-100"&gt;</w:t>
+      </w:r>
+    </w:p>
+    <w:p>
+      <w:r>
+        <w:t xml:space="preserve">      {/* Left Panel - Hand Grid */}</w:t>
+      </w:r>
+    </w:p>
+    <w:p>
+      <w:r>
+        <w:t xml:space="preserve">      &lt;div </w:t>
+      </w:r>
+      <w:proofErr w:type="spellStart"/>
+      <w:r>
+        <w:t>className</w:t>
+      </w:r>
+      <w:proofErr w:type="spellEnd"/>
+      <w:r>
+        <w:t xml:space="preserve">="w-1/3 p-4 </w:t>
+      </w:r>
+      <w:proofErr w:type="spellStart"/>
+      <w:r>
+        <w:t>bg</w:t>
+      </w:r>
+      <w:proofErr w:type="spellEnd"/>
+      <w:r>
+        <w:t>-white border-r"&gt;</w:t>
+      </w:r>
+    </w:p>
+    <w:p>
+      <w:r>
+        <w:t xml:space="preserve">        &lt;div </w:t>
+      </w:r>
+      <w:proofErr w:type="spellStart"/>
+      <w:r>
+        <w:t>className</w:t>
+      </w:r>
+      <w:proofErr w:type="spellEnd"/>
+      <w:r>
+        <w:t>="mb-4"&gt;</w:t>
+      </w:r>
+    </w:p>
+    <w:p>
+      <w:r>
+        <w:lastRenderedPageBreak/>
+        <w:t xml:space="preserve">          &lt;h2 </w:t>
+      </w:r>
+      <w:proofErr w:type="spellStart"/>
+      <w:r>
+        <w:t>className</w:t>
+      </w:r>
+      <w:proofErr w:type="spellEnd"/>
+      <w:r>
+        <w:t xml:space="preserve">="text-xl font-bold mb-2"&gt;Texas </w:t>
+      </w:r>
+      <w:proofErr w:type="spellStart"/>
+      <w:r>
+        <w:t>Hold'em</w:t>
+      </w:r>
+      <w:proofErr w:type="spellEnd"/>
+      <w:r>
+        <w:t xml:space="preserve"> Starting Hands&lt;/h2&gt;</w:t>
+      </w:r>
+    </w:p>
+    <w:p>
+      <w:r>
+        <w:t xml:space="preserve">          &lt;div </w:t>
+      </w:r>
+      <w:proofErr w:type="spellStart"/>
+      <w:r>
+        <w:t>className</w:t>
+      </w:r>
+      <w:proofErr w:type="spellEnd"/>
+      <w:r>
+        <w:t>="flex gap-2 mb-4"&gt;</w:t>
+      </w:r>
+    </w:p>
+    <w:p>
+      <w:r>
+        <w:t xml:space="preserve">            {</w:t>
+      </w:r>
+      <w:proofErr w:type="spellStart"/>
+      <w:proofErr w:type="gramStart"/>
+      <w:r>
+        <w:t>modes.map</w:t>
+      </w:r>
+      <w:proofErr w:type="spellEnd"/>
+      <w:r>
+        <w:t>(</w:t>
+      </w:r>
+      <w:proofErr w:type="gramEnd"/>
+      <w:r>
+        <w:t>mode =&gt; (</w:t>
+      </w:r>
+    </w:p>
+    <w:p>
+      <w:r>
+        <w:t xml:space="preserve">              &lt;button</w:t>
+      </w:r>
+    </w:p>
+    <w:p>
+      <w:r>
+        <w:t xml:space="preserve">                key={mode}</w:t>
+      </w:r>
+    </w:p>
+    <w:p>
+      <w:r>
+        <w:t xml:space="preserve">                </w:t>
+      </w:r>
+      <w:proofErr w:type="spellStart"/>
+      <w:r>
+        <w:t>onClick</w:t>
+      </w:r>
+      <w:proofErr w:type="spellEnd"/>
+      <w:proofErr w:type="gramStart"/>
+      <w:r>
+        <w:t>={</w:t>
+      </w:r>
+      <w:proofErr w:type="gramEnd"/>
+      <w:r>
+        <w:t>() =&gt; {</w:t>
+      </w:r>
+    </w:p>
+    <w:p>
+      <w:r>
+        <w:t xml:space="preserve">                  </w:t>
+      </w:r>
+      <w:proofErr w:type="spellStart"/>
+      <w:r>
+        <w:t>setCurrentMode</w:t>
+      </w:r>
+      <w:proofErr w:type="spellEnd"/>
+      <w:r>
+        <w:t>(mode);</w:t>
+      </w:r>
+    </w:p>
+    <w:p>
+      <w:r>
+        <w:t xml:space="preserve">                  if (mode === 'Compare' &amp;&amp; </w:t>
+      </w:r>
+      <w:proofErr w:type="spellStart"/>
+      <w:r>
+        <w:t>selectedHands.length</w:t>
+      </w:r>
+      <w:proofErr w:type="spellEnd"/>
+      <w:r>
+        <w:t xml:space="preserve"> &gt; 4) {</w:t>
+      </w:r>
+    </w:p>
+    <w:p>
+      <w:r>
+        <w:t xml:space="preserve">                    </w:t>
+      </w:r>
+      <w:proofErr w:type="spellStart"/>
+      <w:proofErr w:type="gramStart"/>
+      <w:r>
+        <w:t>setSelectedHands</w:t>
+      </w:r>
+      <w:proofErr w:type="spellEnd"/>
+      <w:r>
+        <w:t>(</w:t>
+      </w:r>
+      <w:proofErr w:type="spellStart"/>
+      <w:proofErr w:type="gramEnd"/>
+      <w:r>
+        <w:t>prev</w:t>
+      </w:r>
+      <w:proofErr w:type="spellEnd"/>
+      <w:r>
+        <w:t xml:space="preserve"> =&gt; </w:t>
+      </w:r>
+      <w:proofErr w:type="spellStart"/>
+      <w:proofErr w:type="gramStart"/>
+      <w:r>
+        <w:t>prev.slice</w:t>
+      </w:r>
+      <w:proofErr w:type="spellEnd"/>
+      <w:proofErr w:type="gramEnd"/>
+      <w:r>
+        <w:t>(0, 4));</w:t>
+      </w:r>
+    </w:p>
+    <w:p>
+      <w:r>
+        <w:t xml:space="preserve">                  }</w:t>
+      </w:r>
+    </w:p>
+    <w:p>
+      <w:r>
+        <w:t xml:space="preserve">                }}</w:t>
+      </w:r>
+    </w:p>
+    <w:p>
+      <w:r>
+        <w:t xml:space="preserve">                </w:t>
+      </w:r>
+      <w:proofErr w:type="spellStart"/>
+      <w:r>
+        <w:t>className</w:t>
+      </w:r>
+      <w:proofErr w:type="spellEnd"/>
+      <w:proofErr w:type="gramStart"/>
+      <w:r>
+        <w:t>={</w:t>
+      </w:r>
+      <w:proofErr w:type="gramEnd"/>
+      <w:r>
+        <w:t>`px-3 py-1 rounded text-</w:t>
+      </w:r>
+      <w:proofErr w:type="spellStart"/>
+      <w:r>
+        <w:t>sm</w:t>
+      </w:r>
+      <w:proofErr w:type="spellEnd"/>
+      <w:r>
+        <w:t xml:space="preserve"> font-medium transition-</w:t>
+      </w:r>
+      <w:proofErr w:type="spellStart"/>
+      <w:r>
+        <w:t>colors</w:t>
+      </w:r>
+      <w:proofErr w:type="spellEnd"/>
+      <w:r>
+        <w:t xml:space="preserve"> ${</w:t>
+      </w:r>
+    </w:p>
+    <w:p>
+      <w:r>
+        <w:t xml:space="preserve">                  </w:t>
+      </w:r>
+      <w:proofErr w:type="spellStart"/>
+      <w:r>
+        <w:t>currentMode</w:t>
+      </w:r>
+      <w:proofErr w:type="spellEnd"/>
+      <w:r>
+        <w:t xml:space="preserve"> === mode </w:t>
+      </w:r>
+    </w:p>
+    <w:p>
+      <w:r>
+        <w:t xml:space="preserve">                    ? '</w:t>
+      </w:r>
+      <w:proofErr w:type="gramStart"/>
+      <w:r>
+        <w:t>bg</w:t>
+      </w:r>
+      <w:proofErr w:type="gramEnd"/>
+      <w:r>
+        <w:t xml:space="preserve">-blue-500 text-white' </w:t>
+      </w:r>
+    </w:p>
+    <w:p>
+      <w:r>
+        <w:t xml:space="preserve">                    : 'bg-gray-200 text-gray-700 hover:bg-gray-300'</w:t>
+      </w:r>
+    </w:p>
+    <w:p>
+      <w:r>
+        <w:t xml:space="preserve">                }`}</w:t>
+      </w:r>
+    </w:p>
+    <w:p>
+      <w:r>
+        <w:t xml:space="preserve">              &gt;</w:t>
+      </w:r>
+    </w:p>
+    <w:p>
+      <w:r>
+        <w:t xml:space="preserve">                {mode}</w:t>
+      </w:r>
+    </w:p>
+    <w:p>
+      <w:r>
+        <w:t xml:space="preserve">              &lt;/button&gt;</w:t>
+      </w:r>
+    </w:p>
+    <w:p>
+      <w:r>
+        <w:t xml:space="preserve">            ))}</w:t>
+      </w:r>
+    </w:p>
+    <w:p>
+      <w:r>
+        <w:t xml:space="preserve">          &lt;/div&gt;</w:t>
+      </w:r>
+    </w:p>
+    <w:p>
+      <w:r>
+        <w:t xml:space="preserve">          &lt;div </w:t>
+      </w:r>
+      <w:proofErr w:type="spellStart"/>
+      <w:r>
+        <w:t>className</w:t>
+      </w:r>
+      <w:proofErr w:type="spellEnd"/>
+      <w:r>
+        <w:t>="text-</w:t>
+      </w:r>
+      <w:proofErr w:type="spellStart"/>
+      <w:r>
+        <w:t>sm</w:t>
+      </w:r>
+      <w:proofErr w:type="spellEnd"/>
+      <w:r>
+        <w:t xml:space="preserve"> text-gray-600 mb-2"&gt;</w:t>
+      </w:r>
+    </w:p>
+    <w:p>
+      <w:r>
+        <w:t xml:space="preserve">            Selected: {</w:t>
+      </w:r>
+      <w:proofErr w:type="spellStart"/>
+      <w:r>
+        <w:t>selectedHands.length</w:t>
+      </w:r>
+      <w:proofErr w:type="spellEnd"/>
+      <w:r>
+        <w:t xml:space="preserve">} </w:t>
+      </w:r>
+      <w:proofErr w:type="gramStart"/>
+      <w:r>
+        <w:t>hand{</w:t>
+      </w:r>
+      <w:proofErr w:type="spellStart"/>
+      <w:r>
+        <w:t>selectedHands.length</w:t>
+      </w:r>
+      <w:proofErr w:type="spellEnd"/>
+      <w:r>
+        <w:t xml:space="preserve"> !</w:t>
+      </w:r>
+      <w:proofErr w:type="gramEnd"/>
+      <w:r>
+        <w:t xml:space="preserve">== </w:t>
+      </w:r>
+      <w:proofErr w:type="gramStart"/>
+      <w:r>
+        <w:t>1 ?</w:t>
+      </w:r>
+      <w:proofErr w:type="gramEnd"/>
+      <w:r>
+        <w:t xml:space="preserve"> 's</w:t>
+      </w:r>
+      <w:proofErr w:type="gramStart"/>
+      <w:r>
+        <w:t>' :</w:t>
+      </w:r>
+      <w:proofErr w:type="gramEnd"/>
+      <w:r>
+        <w:t xml:space="preserve"> ''}</w:t>
+      </w:r>
+    </w:p>
+    <w:p>
+      <w:r>
+        <w:t xml:space="preserve">            {</w:t>
+      </w:r>
+      <w:proofErr w:type="spellStart"/>
+      <w:r>
+        <w:t>currentMode</w:t>
+      </w:r>
+      <w:proofErr w:type="spellEnd"/>
+      <w:r>
+        <w:t xml:space="preserve"> === 'Compare' &amp;&amp; ' (max 4)'}</w:t>
+      </w:r>
+    </w:p>
+    <w:p>
+      <w:r>
+        <w:t xml:space="preserve">          &lt;/div&gt;</w:t>
+      </w:r>
+    </w:p>
+    <w:p>
+      <w:r>
+        <w:t xml:space="preserve">          {</w:t>
+      </w:r>
+      <w:proofErr w:type="spellStart"/>
+      <w:r>
+        <w:t>selectedHands.length</w:t>
+      </w:r>
+      <w:proofErr w:type="spellEnd"/>
+      <w:r>
+        <w:t xml:space="preserve"> &gt; 0 &amp;&amp; (</w:t>
+      </w:r>
+    </w:p>
+    <w:p>
+      <w:r>
+        <w:t xml:space="preserve">            &lt;button</w:t>
+      </w:r>
+    </w:p>
+    <w:p>
+      <w:r>
+        <w:t xml:space="preserve">              </w:t>
+      </w:r>
+      <w:proofErr w:type="spellStart"/>
+      <w:r>
+        <w:t>onClick</w:t>
+      </w:r>
+      <w:proofErr w:type="spellEnd"/>
+      <w:proofErr w:type="gramStart"/>
+      <w:r>
+        <w:t>={</w:t>
+      </w:r>
+      <w:proofErr w:type="gramEnd"/>
+      <w:r>
+        <w:t xml:space="preserve">() =&gt; </w:t>
+      </w:r>
+      <w:proofErr w:type="spellStart"/>
+      <w:proofErr w:type="gramStart"/>
+      <w:r>
+        <w:t>setSelectedHands</w:t>
+      </w:r>
+      <w:proofErr w:type="spellEnd"/>
+      <w:r>
+        <w:t>(</w:t>
+      </w:r>
+      <w:proofErr w:type="gramEnd"/>
+      <w:r>
+        <w:t>[])}</w:t>
+      </w:r>
+    </w:p>
+    <w:p>
+      <w:r>
+        <w:t xml:space="preserve">              </w:t>
+      </w:r>
+      <w:proofErr w:type="spellStart"/>
+      <w:r>
+        <w:t>className</w:t>
+      </w:r>
+      <w:proofErr w:type="spellEnd"/>
+      <w:r>
+        <w:t>="text-</w:t>
+      </w:r>
+      <w:proofErr w:type="spellStart"/>
+      <w:r>
+        <w:t>sm</w:t>
+      </w:r>
+      <w:proofErr w:type="spellEnd"/>
+      <w:r>
+        <w:t xml:space="preserve"> text-red-600 hover:text-red-800 underline mb-4"</w:t>
+      </w:r>
+    </w:p>
+    <w:p>
+      <w:r>
+        <w:t xml:space="preserve">            &gt;</w:t>
+      </w:r>
+    </w:p>
+    <w:p>
+      <w:r>
+        <w:t xml:space="preserve">              Clear All</w:t>
+      </w:r>
+    </w:p>
+    <w:p>
+      <w:r>
+        <w:lastRenderedPageBreak/>
+        <w:t xml:space="preserve">            &lt;/button&gt;</w:t>
+      </w:r>
+    </w:p>
+    <w:p>
+      <w:r>
+        <w:t xml:space="preserve">          )}</w:t>
+      </w:r>
+    </w:p>
+    <w:p>
+      <w:r>
+        <w:t xml:space="preserve">        &lt;/div&gt;</w:t>
+      </w:r>
+    </w:p>
+    <w:p>
+      <w:r>
+        <w:t xml:space="preserve">        </w:t>
+      </w:r>
+    </w:p>
+    <w:p>
+      <w:r>
+        <w:t xml:space="preserve">        &lt;div </w:t>
+      </w:r>
+      <w:proofErr w:type="spellStart"/>
+      <w:r>
+        <w:t>className</w:t>
+      </w:r>
+      <w:proofErr w:type="spellEnd"/>
+      <w:r>
+        <w:t>="grid grid-cols-13 gap-1 text-</w:t>
+      </w:r>
+      <w:proofErr w:type="spellStart"/>
+      <w:r>
+        <w:t>xs</w:t>
+      </w:r>
+      <w:proofErr w:type="spellEnd"/>
+      <w:r>
+        <w:t>"&gt;</w:t>
+      </w:r>
+    </w:p>
+    <w:p>
+      <w:r>
+        <w:t xml:space="preserve">          {</w:t>
+      </w:r>
+      <w:proofErr w:type="spellStart"/>
+      <w:proofErr w:type="gramStart"/>
+      <w:r>
+        <w:t>HAND_GRID.map</w:t>
+      </w:r>
+      <w:proofErr w:type="spellEnd"/>
+      <w:r>
+        <w:t>(</w:t>
+      </w:r>
+      <w:proofErr w:type="gramEnd"/>
+      <w:r>
+        <w:t xml:space="preserve">(row, </w:t>
+      </w:r>
+      <w:proofErr w:type="spellStart"/>
+      <w:r>
+        <w:t>rowIdx</w:t>
+      </w:r>
+      <w:proofErr w:type="spellEnd"/>
+      <w:r>
+        <w:t xml:space="preserve">) =&gt; </w:t>
+      </w:r>
+    </w:p>
+    <w:p>
+      <w:r>
+        <w:t xml:space="preserve">            </w:t>
+      </w:r>
+      <w:proofErr w:type="spellStart"/>
+      <w:proofErr w:type="gramStart"/>
+      <w:r>
+        <w:t>row.map</w:t>
+      </w:r>
+      <w:proofErr w:type="spellEnd"/>
+      <w:r>
+        <w:t>(</w:t>
+      </w:r>
+      <w:proofErr w:type="gramEnd"/>
+      <w:r>
+        <w:t xml:space="preserve">(hand, </w:t>
+      </w:r>
+      <w:proofErr w:type="spellStart"/>
+      <w:r>
+        <w:t>colIdx</w:t>
+      </w:r>
+      <w:proofErr w:type="spellEnd"/>
+      <w:r>
+        <w:t>) =&gt; (</w:t>
+      </w:r>
+    </w:p>
+    <w:p>
+      <w:r>
+        <w:t xml:space="preserve">              &lt;div</w:t>
+      </w:r>
+    </w:p>
+    <w:p>
+      <w:r>
+        <w:t xml:space="preserve">                key={`${</w:t>
+      </w:r>
+      <w:proofErr w:type="spellStart"/>
+      <w:r>
+        <w:t>rowIdx</w:t>
+      </w:r>
+      <w:proofErr w:type="spellEnd"/>
+      <w:r>
+        <w:t>}-${</w:t>
+      </w:r>
+      <w:proofErr w:type="spellStart"/>
+      <w:r>
+        <w:t>colIdx</w:t>
+      </w:r>
+      <w:proofErr w:type="spellEnd"/>
+      <w:r>
+        <w:t>}`}</w:t>
+      </w:r>
+    </w:p>
+    <w:p>
+      <w:r>
+        <w:t xml:space="preserve">                style={</w:t>
+      </w:r>
+      <w:proofErr w:type="spellStart"/>
+      <w:r>
+        <w:t>getHandStyle</w:t>
+      </w:r>
+      <w:proofErr w:type="spellEnd"/>
+      <w:r>
+        <w:t>(hand)}</w:t>
+      </w:r>
+    </w:p>
+    <w:p>
+      <w:r>
+        <w:t xml:space="preserve">                </w:t>
+      </w:r>
+      <w:proofErr w:type="spellStart"/>
+      <w:r>
+        <w:t>onClick</w:t>
+      </w:r>
+      <w:proofErr w:type="spellEnd"/>
+      <w:proofErr w:type="gramStart"/>
+      <w:r>
+        <w:t>={</w:t>
+      </w:r>
+      <w:proofErr w:type="gramEnd"/>
+      <w:r>
+        <w:t xml:space="preserve">() =&gt; </w:t>
+      </w:r>
+      <w:proofErr w:type="spellStart"/>
+      <w:r>
+        <w:t>toggleHandSelection</w:t>
+      </w:r>
+      <w:proofErr w:type="spellEnd"/>
+      <w:r>
+        <w:t>(hand)}</w:t>
+      </w:r>
+    </w:p>
+    <w:p>
+      <w:r>
+        <w:t xml:space="preserve">                </w:t>
+      </w:r>
+      <w:proofErr w:type="spellStart"/>
+      <w:r>
+        <w:t>className</w:t>
+      </w:r>
+      <w:proofErr w:type="spellEnd"/>
+      <w:r>
+        <w:t>="</w:t>
+      </w:r>
+      <w:proofErr w:type="gramStart"/>
+      <w:r>
+        <w:t>hover:opacity</w:t>
+      </w:r>
+      <w:proofErr w:type="gramEnd"/>
+      <w:r>
+        <w:t>-100 select-none"</w:t>
+      </w:r>
+    </w:p>
+    <w:p>
+      <w:r>
+        <w:t xml:space="preserve">              &gt;</w:t>
+      </w:r>
+    </w:p>
+    <w:p>
+      <w:r>
+        <w:t xml:space="preserve">                {hand}</w:t>
+      </w:r>
+    </w:p>
+    <w:p>
+      <w:r>
+        <w:t xml:space="preserve">              &lt;/div&gt;</w:t>
+      </w:r>
+    </w:p>
+    <w:p>
+      <w:r>
+        <w:t xml:space="preserve">            ))</w:t>
+      </w:r>
+    </w:p>
+    <w:p>
+      <w:r>
+        <w:t xml:space="preserve">          )}</w:t>
+      </w:r>
+    </w:p>
+    <w:p>
+      <w:r>
+        <w:t xml:space="preserve">        &lt;/div&gt;</w:t>
+      </w:r>
+    </w:p>
+    <w:p>
+      <w:r>
+        <w:t xml:space="preserve">        </w:t>
+      </w:r>
+    </w:p>
+    <w:p>
+      <w:r>
+        <w:t xml:space="preserve">        &lt;div </w:t>
+      </w:r>
+      <w:proofErr w:type="spellStart"/>
+      <w:r>
+        <w:t>className</w:t>
+      </w:r>
+      <w:proofErr w:type="spellEnd"/>
+      <w:r>
+        <w:t>="mt-4 text-</w:t>
+      </w:r>
+      <w:proofErr w:type="spellStart"/>
+      <w:r>
+        <w:t>xs</w:t>
+      </w:r>
+      <w:proofErr w:type="spellEnd"/>
+      <w:r>
+        <w:t xml:space="preserve"> text-gray-600"&gt;</w:t>
+      </w:r>
+    </w:p>
+    <w:p>
+      <w:r>
+        <w:t xml:space="preserve">          &lt;div </w:t>
+      </w:r>
+      <w:proofErr w:type="spellStart"/>
+      <w:r>
+        <w:t>className</w:t>
+      </w:r>
+      <w:proofErr w:type="spellEnd"/>
+      <w:r>
+        <w:t>="flex items-</w:t>
+      </w:r>
+      <w:proofErr w:type="spellStart"/>
+      <w:r>
+        <w:t>center</w:t>
+      </w:r>
+      <w:proofErr w:type="spellEnd"/>
+      <w:r>
+        <w:t xml:space="preserve"> gap-2 mb-1"&gt;</w:t>
+      </w:r>
+    </w:p>
+    <w:p>
+      <w:r>
+        <w:t xml:space="preserve">            &lt;div </w:t>
+      </w:r>
+      <w:proofErr w:type="spellStart"/>
+      <w:r>
+        <w:t>className</w:t>
+      </w:r>
+      <w:proofErr w:type="spellEnd"/>
+      <w:r>
+        <w:t>="w-4 h-4 bg-red-600 rounded"&gt;&lt;/div&gt;</w:t>
+      </w:r>
+    </w:p>
+    <w:p>
+      <w:r>
+        <w:t xml:space="preserve">            &lt;span&gt;Pairs &amp; </w:t>
+      </w:r>
+      <w:proofErr w:type="spellStart"/>
+      <w:r>
+        <w:t>Offsuit</w:t>
+      </w:r>
+      <w:proofErr w:type="spellEnd"/>
+      <w:r>
+        <w:t>&lt;/span&gt;</w:t>
+      </w:r>
+    </w:p>
+    <w:p>
+      <w:r>
+        <w:t xml:space="preserve">          &lt;/div&gt;</w:t>
+      </w:r>
+    </w:p>
+    <w:p>
+      <w:r>
+        <w:t xml:space="preserve">          &lt;div </w:t>
+      </w:r>
+      <w:proofErr w:type="spellStart"/>
+      <w:r>
+        <w:t>className</w:t>
+      </w:r>
+      <w:proofErr w:type="spellEnd"/>
+      <w:r>
+        <w:t>="flex items-</w:t>
+      </w:r>
+      <w:proofErr w:type="spellStart"/>
+      <w:r>
+        <w:t>center</w:t>
+      </w:r>
+      <w:proofErr w:type="spellEnd"/>
+      <w:r>
+        <w:t xml:space="preserve"> gap-2"&gt;</w:t>
+      </w:r>
+    </w:p>
+    <w:p>
+      <w:r>
+        <w:t xml:space="preserve">            &lt;div </w:t>
+      </w:r>
+      <w:proofErr w:type="spellStart"/>
+      <w:r>
+        <w:t>className</w:t>
+      </w:r>
+      <w:proofErr w:type="spellEnd"/>
+      <w:r>
+        <w:t>="w-4 h-4 bg-green-600 rounded"&gt;&lt;/div&gt;</w:t>
+      </w:r>
+    </w:p>
+    <w:p>
+      <w:r>
+        <w:t xml:space="preserve">            &lt;span&gt;Suited&lt;/span&gt;</w:t>
+      </w:r>
+    </w:p>
+    <w:p>
+      <w:r>
+        <w:t xml:space="preserve">          &lt;/div&gt;</w:t>
+      </w:r>
+    </w:p>
+    <w:p>
+      <w:r>
+        <w:t xml:space="preserve">        &lt;/div&gt;</w:t>
+      </w:r>
+    </w:p>
+    <w:p>
+      <w:r>
+        <w:t xml:space="preserve">      &lt;/div&gt;</w:t>
+      </w:r>
+    </w:p>
+    <w:p/>
+    <w:p>
+      <w:r>
+        <w:lastRenderedPageBreak/>
+        <w:t xml:space="preserve">      {/* Right Panel - Charts */}</w:t>
+      </w:r>
+    </w:p>
+    <w:p>
+      <w:r>
+        <w:t xml:space="preserve">      &lt;div </w:t>
+      </w:r>
+      <w:proofErr w:type="spellStart"/>
+      <w:r>
+        <w:t>className</w:t>
+      </w:r>
+      <w:proofErr w:type="spellEnd"/>
+      <w:r>
+        <w:t>="flex-1 p-4"&gt;</w:t>
+      </w:r>
+    </w:p>
+    <w:p>
+      <w:r>
+        <w:t xml:space="preserve">        &lt;div </w:t>
+      </w:r>
+      <w:proofErr w:type="spellStart"/>
+      <w:r>
+        <w:t>className</w:t>
+      </w:r>
+      <w:proofErr w:type="spellEnd"/>
+      <w:r>
+        <w:t xml:space="preserve">="h-full </w:t>
+      </w:r>
+      <w:proofErr w:type="spellStart"/>
+      <w:r>
+        <w:t>bg</w:t>
+      </w:r>
+      <w:proofErr w:type="spellEnd"/>
+      <w:r>
+        <w:t>-white rounded-</w:t>
+      </w:r>
+      <w:proofErr w:type="spellStart"/>
+      <w:r>
+        <w:t>lg</w:t>
+      </w:r>
+      <w:proofErr w:type="spellEnd"/>
+      <w:r>
+        <w:t xml:space="preserve"> shadow p-6"&gt;</w:t>
+      </w:r>
+    </w:p>
+    <w:p>
+      <w:r>
+        <w:t xml:space="preserve">          {</w:t>
+      </w:r>
+      <w:proofErr w:type="spellStart"/>
+      <w:r>
+        <w:t>currentMode</w:t>
+      </w:r>
+      <w:proofErr w:type="spellEnd"/>
+      <w:r>
+        <w:t xml:space="preserve"> === 'Compare' &amp;&amp; </w:t>
+      </w:r>
+      <w:proofErr w:type="spellStart"/>
+      <w:proofErr w:type="gramStart"/>
+      <w:r>
+        <w:t>renderCompareMode</w:t>
+      </w:r>
+      <w:proofErr w:type="spellEnd"/>
+      <w:r>
+        <w:t>(</w:t>
+      </w:r>
+      <w:proofErr w:type="gramEnd"/>
+      <w:r>
+        <w:t>)}</w:t>
+      </w:r>
+    </w:p>
+    <w:p>
+      <w:r>
+        <w:t xml:space="preserve">          {</w:t>
+      </w:r>
+      <w:proofErr w:type="spellStart"/>
+      <w:r>
+        <w:t>currentMode</w:t>
+      </w:r>
+      <w:proofErr w:type="spellEnd"/>
+      <w:r>
+        <w:t xml:space="preserve"> === 'Range' &amp;&amp; </w:t>
+      </w:r>
+      <w:proofErr w:type="spellStart"/>
+      <w:proofErr w:type="gramStart"/>
+      <w:r>
+        <w:t>renderRangeMode</w:t>
+      </w:r>
+      <w:proofErr w:type="spellEnd"/>
+      <w:r>
+        <w:t>(</w:t>
+      </w:r>
+      <w:proofErr w:type="gramEnd"/>
+      <w:r>
+        <w:t>)}</w:t>
+      </w:r>
+    </w:p>
+    <w:p>
+      <w:r>
+        <w:t xml:space="preserve">          {</w:t>
+      </w:r>
+      <w:proofErr w:type="spellStart"/>
+      <w:r>
+        <w:t>currentMode</w:t>
+      </w:r>
+      <w:proofErr w:type="spellEnd"/>
+      <w:r>
+        <w:t xml:space="preserve"> === 'Cumulative' &amp;&amp; </w:t>
+      </w:r>
+      <w:proofErr w:type="spellStart"/>
+      <w:proofErr w:type="gramStart"/>
+      <w:r>
+        <w:t>renderCumulativeMode</w:t>
+      </w:r>
+      <w:proofErr w:type="spellEnd"/>
+      <w:r>
+        <w:t>(</w:t>
+      </w:r>
+      <w:proofErr w:type="gramEnd"/>
+      <w:r>
+        <w:t>)}</w:t>
+      </w:r>
+    </w:p>
+    <w:p>
+      <w:r>
+        <w:t xml:space="preserve">        &lt;/div&gt;</w:t>
+      </w:r>
+    </w:p>
+    <w:p>
+      <w:r>
+        <w:t xml:space="preserve">      &lt;/div&gt;</w:t>
+      </w:r>
+    </w:p>
+    <w:p>
+      <w:r>
+        <w:t xml:space="preserve">    &lt;/div&gt;</w:t>
+      </w:r>
+    </w:p>
+    <w:p>
+      <w:r>
+        <w:t xml:space="preserve">  );</w:t>
+      </w:r>
+    </w:p>
+    <w:p>
+      <w:r>
+        <w:t>};</w:t>
+      </w:r>
+    </w:p>
+    <w:p/>
+    <w:p>
+      <w:r>
+        <w:t xml:space="preserve">export default </w:t>
+      </w:r>
+      <w:proofErr w:type="spellStart"/>
+      <w:r>
+        <w:t>PokerHandAnalyzer</w:t>
+      </w:r>
+      <w:proofErr w:type="spellEnd"/>
+      <w:r>
+        <w:t>;</w:t>
+      </w:r>
+    </w:p>
+    <w:p/>
+    <w:p/>
+    <w:p>
+      <w:r>
+        <w:t>That is a great start. A few things:</w:t>
+      </w:r>
+    </w:p>
+    <w:p>
+      <w:pPr>
+        <w:numPr>
+          <w:ilvl w:val="0"/>
+          <w:numId w:val="1"/>
+        </w:numPr>
+      </w:pPr>
+      <w:r>
+        <w:t xml:space="preserve">I want to make this a proper React project, with a proper structure. Can you give me instructions to set this </w:t>
+      </w:r>
+      <w:proofErr w:type="gramStart"/>
+      <w:r>
+        <w:t>up ?</w:t>
+      </w:r>
+      <w:proofErr w:type="gramEnd"/>
+    </w:p>
+    <w:p>
+      <w:pPr>
+        <w:numPr>
+          <w:ilvl w:val="0"/>
+          <w:numId w:val="1"/>
+        </w:numPr>
+      </w:pPr>
+      <w:r>
+        <w:t xml:space="preserve">The starting hand grid needs to be a 13 x 13 grid, not a column. The rows are from A down to 2, the columns are from A down to 2. </w:t>
+      </w:r>
+      <w:proofErr w:type="spellStart"/>
+      <w:r>
+        <w:t>Offsuit</w:t>
+      </w:r>
+      <w:proofErr w:type="spellEnd"/>
+      <w:r>
+        <w:t xml:space="preserve"> hands are below the diagonal, suited hands above, and pairs are on the diagonal.</w:t>
+      </w:r>
+    </w:p>
+    <w:p>
+      <w:pPr>
+        <w:numPr>
+          <w:ilvl w:val="0"/>
+          <w:numId w:val="1"/>
+        </w:numPr>
+      </w:pPr>
+      <w:r>
+        <w:t>I would like the user to have to choose one of Compare and Range.</w:t>
+      </w:r>
+    </w:p>
+    <w:p>
+      <w:pPr>
+        <w:numPr>
+          <w:ilvl w:val="0"/>
+          <w:numId w:val="1"/>
+        </w:numPr>
+      </w:pPr>
+      <w:r>
+        <w:t>I would also like the user to choose one of Rank Frequencies, Cumulative Rank Frequencies, or Both Rank Frequencies and Cumulative Rank Frequencies. If the user chooses both, then they should only be able to choose the Range option.</w:t>
       </w:r>
     </w:p>
     <w:p/>
@@ -93,6 +4175,163 @@
     </w:sectPr>
   </w:body>
 </w:document>
+</file>
+
+<file path=word/numbering.xml><?xml version="1.0" encoding="utf-8"?>
+<w:numbering xmlns:wpc="http://schemas.microsoft.com/office/word/2010/wordprocessingCanvas" xmlns:cx="http://schemas.microsoft.com/office/drawing/2014/chartex" xmlns:cx1="http://schemas.microsoft.com/office/drawing/2015/9/8/chartex" xmlns:cx2="http://schemas.microsoft.com/office/drawing/2015/10/21/chartex" xmlns:cx3="http://schemas.microsoft.com/office/drawing/2016/5/9/chartex" xmlns:cx4="http://schemas.microsoft.com/office/drawing/2016/5/10/chartex" xmlns:cx5="http://schemas.microsoft.com/office/drawing/2016/5/11/chartex" xmlns:cx6="http://schemas.microsoft.com/office/drawing/2016/5/12/chartex" xmlns:cx7="http://schemas.microsoft.com/office/drawing/2016/5/13/chartex" xmlns:cx8="http://schemas.microsoft.com/office/drawing/2016/5/14/chartex" xmlns:mc="http://schemas.openxmlformats.org/markup-compatibility/2006" xmlns:aink="http://schemas.microsoft.com/office/drawing/2016/ink" xmlns:am3d="http://schemas.microsoft.com/office/drawing/2017/model3d" xmlns:o="urn:schemas-microsoft-com:office:office" xmlns:oel="http://schemas.microsoft.com/office/2019/extlst" xmlns:r="http://schemas.openxmlformats.org/officeDocument/2006/relationships" xmlns:m="http://schemas.openxmlformats.org/officeDocument/2006/math" xmlns:v="urn:schemas-microsoft-com:vml" xmlns:wp14="http://schemas.microsoft.com/office/word/2010/wordprocessingDrawing" xmlns:wp="http://schemas.openxmlformats.org/drawingml/2006/wordprocessingDrawing" xmlns:w10="urn:schemas-microsoft-com:office:word" xmlns:w="http://schemas.openxmlformats.org/wordprocessingml/2006/main" xmlns:w14="http://schemas.microsoft.com/office/word/2010/wordml" xmlns:w15="http://schemas.microsoft.com/office/word/2012/wordml" xmlns:w16cex="http://schemas.microsoft.com/office/word/2018/wordml/cex" xmlns:w16cid="http://schemas.microsoft.com/office/word/2016/wordml/cid" xmlns:w16="http://schemas.microsoft.com/office/word/2018/wordml" xmlns:w16du="http://schemas.microsoft.com/office/word/2023/wordml/word16du" xmlns:w16sdtdh="http://schemas.microsoft.com/office/word/2020/wordml/sdtdatahash" xmlns:w16sdtfl="http://schemas.microsoft.com/office/word/2024/wordml/sdtformatlock" xmlns:w16se="http://schemas.microsoft.com/office/word/2015/wordml/symex" xmlns:wpg="http://schemas.microsoft.com/office/word/2010/wordprocessingGroup" xmlns:wpi="http://schemas.microsoft.com/office/word/2010/wordprocessingInk" xmlns:wne="http://schemas.microsoft.com/office/word/2006/wordml" xmlns:wps="http://schemas.microsoft.com/office/word/2010/wordprocessingShape" mc:Ignorable="w14 w15 w16se w16cid w16 w16cex w16sdtdh w16sdtfl w16du wp14">
+  <w:abstractNum w:abstractNumId="0" w15:restartNumberingAfterBreak="0">
+    <w:nsid w:val="06466597"/>
+    <w:multiLevelType w:val="multilevel"/>
+    <w:tmpl w:val="30B4DF46"/>
+    <w:lvl w:ilvl="0">
+      <w:start w:val="1"/>
+      <w:numFmt w:val="bullet"/>
+      <w:lvlText w:val=""/>
+      <w:lvlJc w:val="left"/>
+      <w:pPr>
+        <w:tabs>
+          <w:tab w:val="num" w:pos="720"/>
+        </w:tabs>
+        <w:ind w:left="720" w:hanging="360"/>
+      </w:pPr>
+      <w:rPr>
+        <w:rFonts w:ascii="Symbol" w:hAnsi="Symbol" w:hint="default"/>
+        <w:sz w:val="20"/>
+      </w:rPr>
+    </w:lvl>
+    <w:lvl w:ilvl="1" w:tentative="1">
+      <w:start w:val="1"/>
+      <w:numFmt w:val="bullet"/>
+      <w:lvlText w:val="o"/>
+      <w:lvlJc w:val="left"/>
+      <w:pPr>
+        <w:tabs>
+          <w:tab w:val="num" w:pos="1440"/>
+        </w:tabs>
+        <w:ind w:left="1440" w:hanging="360"/>
+      </w:pPr>
+      <w:rPr>
+        <w:rFonts w:ascii="Courier New" w:hAnsi="Courier New" w:hint="default"/>
+        <w:sz w:val="20"/>
+      </w:rPr>
+    </w:lvl>
+    <w:lvl w:ilvl="2" w:tentative="1">
+      <w:start w:val="1"/>
+      <w:numFmt w:val="bullet"/>
+      <w:lvlText w:val=""/>
+      <w:lvlJc w:val="left"/>
+      <w:pPr>
+        <w:tabs>
+          <w:tab w:val="num" w:pos="2160"/>
+        </w:tabs>
+        <w:ind w:left="2160" w:hanging="360"/>
+      </w:pPr>
+      <w:rPr>
+        <w:rFonts w:ascii="Wingdings" w:hAnsi="Wingdings" w:hint="default"/>
+        <w:sz w:val="20"/>
+      </w:rPr>
+    </w:lvl>
+    <w:lvl w:ilvl="3" w:tentative="1">
+      <w:start w:val="1"/>
+      <w:numFmt w:val="bullet"/>
+      <w:lvlText w:val=""/>
+      <w:lvlJc w:val="left"/>
+      <w:pPr>
+        <w:tabs>
+          <w:tab w:val="num" w:pos="2880"/>
+        </w:tabs>
+        <w:ind w:left="2880" w:hanging="360"/>
+      </w:pPr>
+      <w:rPr>
+        <w:rFonts w:ascii="Wingdings" w:hAnsi="Wingdings" w:hint="default"/>
+        <w:sz w:val="20"/>
+      </w:rPr>
+    </w:lvl>
+    <w:lvl w:ilvl="4" w:tentative="1">
+      <w:start w:val="1"/>
+      <w:numFmt w:val="bullet"/>
+      <w:lvlText w:val=""/>
+      <w:lvlJc w:val="left"/>
+      <w:pPr>
+        <w:tabs>
+          <w:tab w:val="num" w:pos="3600"/>
+        </w:tabs>
+        <w:ind w:left="3600" w:hanging="360"/>
+      </w:pPr>
+      <w:rPr>
+        <w:rFonts w:ascii="Wingdings" w:hAnsi="Wingdings" w:hint="default"/>
+        <w:sz w:val="20"/>
+      </w:rPr>
+    </w:lvl>
+    <w:lvl w:ilvl="5" w:tentative="1">
+      <w:start w:val="1"/>
+      <w:numFmt w:val="bullet"/>
+      <w:lvlText w:val=""/>
+      <w:lvlJc w:val="left"/>
+      <w:pPr>
+        <w:tabs>
+          <w:tab w:val="num" w:pos="4320"/>
+        </w:tabs>
+        <w:ind w:left="4320" w:hanging="360"/>
+      </w:pPr>
+      <w:rPr>
+        <w:rFonts w:ascii="Wingdings" w:hAnsi="Wingdings" w:hint="default"/>
+        <w:sz w:val="20"/>
+      </w:rPr>
+    </w:lvl>
+    <w:lvl w:ilvl="6" w:tentative="1">
+      <w:start w:val="1"/>
+      <w:numFmt w:val="bullet"/>
+      <w:lvlText w:val=""/>
+      <w:lvlJc w:val="left"/>
+      <w:pPr>
+        <w:tabs>
+          <w:tab w:val="num" w:pos="5040"/>
+        </w:tabs>
+        <w:ind w:left="5040" w:hanging="360"/>
+      </w:pPr>
+      <w:rPr>
+        <w:rFonts w:ascii="Wingdings" w:hAnsi="Wingdings" w:hint="default"/>
+        <w:sz w:val="20"/>
+      </w:rPr>
+    </w:lvl>
+    <w:lvl w:ilvl="7" w:tentative="1">
+      <w:start w:val="1"/>
+      <w:numFmt w:val="bullet"/>
+      <w:lvlText w:val=""/>
+      <w:lvlJc w:val="left"/>
+      <w:pPr>
+        <w:tabs>
+          <w:tab w:val="num" w:pos="5760"/>
+        </w:tabs>
+        <w:ind w:left="5760" w:hanging="360"/>
+      </w:pPr>
+      <w:rPr>
+        <w:rFonts w:ascii="Wingdings" w:hAnsi="Wingdings" w:hint="default"/>
+        <w:sz w:val="20"/>
+      </w:rPr>
+    </w:lvl>
+    <w:lvl w:ilvl="8" w:tentative="1">
+      <w:start w:val="1"/>
+      <w:numFmt w:val="bullet"/>
+      <w:lvlText w:val=""/>
+      <w:lvlJc w:val="left"/>
+      <w:pPr>
+        <w:tabs>
+          <w:tab w:val="num" w:pos="6480"/>
+        </w:tabs>
+        <w:ind w:left="6480" w:hanging="360"/>
+      </w:pPr>
+      <w:rPr>
+        <w:rFonts w:ascii="Wingdings" w:hAnsi="Wingdings" w:hint="default"/>
+        <w:sz w:val="20"/>
+      </w:rPr>
+    </w:lvl>
+  </w:abstractNum>
+  <w:num w:numId="1" w16cid:durableId="209457358">
+    <w:abstractNumId w:val="0"/>
+  </w:num>
+</w:numbering>
 </file>
 
 <file path=word/styles.xml><?xml version="1.0" encoding="utf-8"?>

</xml_diff>